<commit_message>
[Docs] JWT: AUDIT 로그 누락 원인/수정 FAQ(Q3) 추가
- 로그인 성공/실패(SecurityAuditListener)와 토큰 없음/무효 401
  (authenticationEntryPoint) 의 감사 로그 경로가 분리돼 있었던 원인 설명
- authenticationEntryPoint() 수정 내용과 실제 로그 예시 반영
</commit_message>
<xml_diff>
--- a/docs/security/06_JWT_Security.docx
+++ b/docs/security/06_JWT_Security.docx
@@ -772,7 +772,7 @@
           <w:i/>
           <w:iCs/>
         </w:rPr>
-        <w:t>HS256 은 같은 secret 으로 서명·검증한다 — secret 유출=위조 가능이라는 1단계의 전제는 2단계에도 남는다. 2단계가 막는 것은 "secret 을 안다고 아무 계정이나 바로 위조할 수 있는가"라는 공격 범위의 문제다(§2).</w:t>
+        <w:t>HS256 은 같은 secret 으로 서명·검증한다 — secret 유출=위조 가능이라는 1단계의 전제는 2단계에도 남는다. 2단계가 막는 것은 "secret 을 안다고 아무 계정이나 바로 위조할 수 있는가"라는 공격 범위의 문제다..</w:t>
       </w:r>
     </w:p>
     <w:p>
@@ -786,7 +786,33 @@
           <w:bCs/>
           <w:color w:val="1F3864"/>
         </w:rPr>
-        <w:t>2. 공격 실습 — 1단계 공격이 2단계에서 왜 무력화되는가</w:t>
+        <w:t>2. 공격 실습 — 1단계 공격이 2단계에서 왜 무력화</w:t>
+      </w:r>
+      <w:r>
+        <w:rPr>
+          <w:rFonts w:hint="eastAsia"/>
+          <w:b/>
+          <w:bCs/>
+          <w:color w:val="1F3864"/>
+        </w:rPr>
+        <w:t xml:space="preserve"> </w:t>
+      </w:r>
+      <w:r>
+        <w:rPr>
+          <w:b/>
+          <w:bCs/>
+          <w:color w:val="1F3864"/>
+        </w:rPr>
+        <w:t>되는가</w:t>
+      </w:r>
+      <w:r>
+        <w:rPr>
+          <w:rFonts w:hint="eastAsia"/>
+          <w:b/>
+          <w:bCs/>
+          <w:color w:val="1F3864"/>
+        </w:rPr>
+        <w:t>?</w:t>
       </w:r>
     </w:p>
     <w:p>
@@ -843,79 +869,7 @@
           <w:sz w:val="18"/>
           <w:szCs w:val="18"/>
         </w:rPr>
-        <w:t>FT=$(python docs/security/jwt_forge.py admin@aa.com)   # 1</w:t>
-      </w:r>
-      <w:r>
-        <w:rPr>
-          <w:rFonts w:ascii="Consolas" w:hAnsi="Consolas"/>
-          <w:sz w:val="18"/>
-          <w:szCs w:val="18"/>
-        </w:rPr>
-        <w:t>단계와</w:t>
-      </w:r>
-      <w:r>
-        <w:rPr>
-          <w:rFonts w:ascii="Consolas" w:hAnsi="Consolas"/>
-          <w:sz w:val="18"/>
-          <w:szCs w:val="18"/>
-        </w:rPr>
-        <w:t xml:space="preserve"> </w:t>
-      </w:r>
-      <w:r>
-        <w:rPr>
-          <w:rFonts w:ascii="Consolas" w:hAnsi="Consolas"/>
-          <w:sz w:val="18"/>
-          <w:szCs w:val="18"/>
-        </w:rPr>
-        <w:t>동일</w:t>
-      </w:r>
-      <w:r>
-        <w:rPr>
-          <w:rFonts w:ascii="Consolas" w:hAnsi="Consolas"/>
-          <w:sz w:val="18"/>
-          <w:szCs w:val="18"/>
-        </w:rPr>
-        <w:t xml:space="preserve">: email </w:t>
-      </w:r>
-      <w:r>
-        <w:rPr>
-          <w:rFonts w:ascii="Consolas" w:hAnsi="Consolas"/>
-          <w:sz w:val="18"/>
-          <w:szCs w:val="18"/>
-        </w:rPr>
-        <w:t>을</w:t>
-      </w:r>
-      <w:r>
-        <w:rPr>
-          <w:rFonts w:ascii="Consolas" w:hAnsi="Consolas"/>
-          <w:sz w:val="18"/>
-          <w:szCs w:val="18"/>
-        </w:rPr>
-        <w:t xml:space="preserve"> sub </w:t>
-      </w:r>
-      <w:r>
-        <w:rPr>
-          <w:rFonts w:ascii="Consolas" w:hAnsi="Consolas"/>
-          <w:sz w:val="18"/>
-          <w:szCs w:val="18"/>
-        </w:rPr>
-        <w:t>로</w:t>
-      </w:r>
-      <w:r>
-        <w:rPr>
-          <w:rFonts w:ascii="Consolas" w:hAnsi="Consolas"/>
-          <w:sz w:val="18"/>
-          <w:szCs w:val="18"/>
-        </w:rPr>
-        <w:t xml:space="preserve"> </w:t>
-      </w:r>
-      <w:r>
-        <w:rPr>
-          <w:rFonts w:ascii="Consolas" w:hAnsi="Consolas"/>
-          <w:sz w:val="18"/>
-          <w:szCs w:val="18"/>
-        </w:rPr>
-        <w:t>서명</w:t>
+        <w:t xml:space="preserve">FT=$(python docs/security/jwt_forge.py admin@aa.com)   # 1단계와 동일: email 을 sub 로 서명</w:t>
       </w:r>
     </w:p>
     <w:p>
@@ -1160,7 +1114,16 @@
         <w:spacing w:after="80" w:line="272" w:lineRule="auto"/>
       </w:pPr>
       <w:r>
-        <w:t>→ secret 이 유출된 사실 자체는 2단계에서도 달라지지 않는다(위조 서명 자체는 여전히 유효하다). 하지만 토큰에 담긴 값이 더 이상 email 이 아니므로, 서버는 "그런 uuid 를 가진 사용자가 없다"고 판단해 인증을 거부한다. "이메일을 안다"는 공격자의 유일한 무기가 2단계에서는 쓸모없어진 것 — 이것이 1단계 공격이 2단계에서 무력화되는 핵심이다.</w:t>
+        <w:t>→ secret 이 유출된 사실 자체는 2단계에서도 달라지지 않는다(위조 서명 자체는 여전히 유효하다). 하지만 토큰에 담긴 값이 더 이상 email 이 아니므로, 서버는 "그런 uuid 를 가진 사용자가 없다"고 판단해 인증을 거부한다. "이메일을 안다"는 공격자의 유일한 무기가 2단계에서는 쓸모없어진 것 — 이것이 1단계 공격이 2단계에서 무력화</w:t>
+      </w:r>
+      <w:r>
+        <w:rPr>
+          <w:rFonts w:hint="eastAsia"/>
+        </w:rPr>
+        <w:t xml:space="preserve"> </w:t>
+      </w:r>
+      <w:r>
+        <w:t>되는 핵심이다.</w:t>
       </w:r>
     </w:p>
     <w:p>
@@ -1185,7 +1148,37 @@
           <w:iCs/>
         </w:rPr>
         <w:lastRenderedPageBreak/>
-        <w:t>참고 — alg:none·서명 변조·payload base64 노출은 1단계 문서(§3-2, §3-3)에서 다뤘고 이 코드에서도 동일하게 차단된다(변경 없음).</w:t>
+        <w:t>참고 — alg:none·서명 변조·payload base64 노출은 1단계 문서(3-2, 3-3)에서 다</w:t>
+      </w:r>
+      <w:r>
+        <w:rPr>
+          <w:rFonts w:hint="eastAsia"/>
+          <w:i/>
+          <w:iCs/>
+        </w:rPr>
+        <w:t>루었</w:t>
+      </w:r>
+      <w:r>
+        <w:rPr>
+          <w:i/>
+          <w:iCs/>
+        </w:rPr>
+        <w:t xml:space="preserve">고 </w:t>
+      </w:r>
+      <w:r>
+        <w:rPr>
+          <w:rFonts w:hint="eastAsia"/>
+          <w:i/>
+          <w:iCs/>
+        </w:rPr>
+        <w:t>2단계</w:t>
+      </w:r>
+      <w:r>
+        <w:rPr>
+          <w:i/>
+          <w:iCs/>
+        </w:rPr>
+        <w:t>에서도 동일하게 차단된다(변경 없음).</w:t>
       </w:r>
     </w:p>
     <w:p>
@@ -1890,23 +1883,7 @@
           <w:sz w:val="18"/>
           <w:szCs w:val="18"/>
         </w:rPr>
-        <w:t>String token = jwtService.generateToken(userDetails.getUuid());      // subject = uuid(</w:t>
-      </w:r>
-      <w:r>
-        <w:rPr>
-          <w:rFonts w:ascii="Consolas" w:hAnsi="Consolas"/>
-          <w:sz w:val="18"/>
-          <w:szCs w:val="18"/>
-        </w:rPr>
-        <w:t>불투명</w:t>
-      </w:r>
-      <w:r>
-        <w:rPr>
-          <w:rFonts w:ascii="Consolas" w:hAnsi="Consolas"/>
-          <w:sz w:val="18"/>
-          <w:szCs w:val="18"/>
-        </w:rPr>
-        <w:t>)</w:t>
+        <w:t>String token = jwtService.generateToken(userDetails.getUuid());      // subject = uuid(불투명)</w:t>
       </w:r>
     </w:p>
     <w:p>
@@ -1967,31 +1944,7 @@
           <w:sz w:val="18"/>
           <w:szCs w:val="18"/>
         </w:rPr>
-        <w:t xml:space="preserve">UserDetails ud = userDetailsService.loadUserByUsername(username);    // email </w:t>
-      </w:r>
-      <w:r>
-        <w:rPr>
-          <w:rFonts w:ascii="Consolas" w:hAnsi="Consolas"/>
-          <w:sz w:val="18"/>
-          <w:szCs w:val="18"/>
-        </w:rPr>
-        <w:t>로</w:t>
-      </w:r>
-      <w:r>
-        <w:rPr>
-          <w:rFonts w:ascii="Consolas" w:hAnsi="Consolas"/>
-          <w:sz w:val="18"/>
-          <w:szCs w:val="18"/>
-        </w:rPr>
-        <w:t xml:space="preserve"> </w:t>
-      </w:r>
-      <w:r>
-        <w:rPr>
-          <w:rFonts w:ascii="Consolas" w:hAnsi="Consolas"/>
-          <w:sz w:val="18"/>
-          <w:szCs w:val="18"/>
-        </w:rPr>
-        <w:t>조회</w:t>
+        <w:t xml:space="preserve">UserDetails ud = userDetailsService.loadUserByUsername(username);    // email 로 조회</w:t>
       </w:r>
     </w:p>
     <w:p>
@@ -2040,31 +1993,7 @@
           <w:sz w:val="18"/>
           <w:szCs w:val="18"/>
         </w:rPr>
-        <w:t xml:space="preserve">UserInfoUserDetails ud = userDetailsService.loadUserByUuid(uuid);    // uuid </w:t>
-      </w:r>
-      <w:r>
-        <w:rPr>
-          <w:rFonts w:ascii="Consolas" w:hAnsi="Consolas"/>
-          <w:sz w:val="18"/>
-          <w:szCs w:val="18"/>
-        </w:rPr>
-        <w:t>로</w:t>
-      </w:r>
-      <w:r>
-        <w:rPr>
-          <w:rFonts w:ascii="Consolas" w:hAnsi="Consolas"/>
-          <w:sz w:val="18"/>
-          <w:szCs w:val="18"/>
-        </w:rPr>
-        <w:t xml:space="preserve"> </w:t>
-      </w:r>
-      <w:r>
-        <w:rPr>
-          <w:rFonts w:ascii="Consolas" w:hAnsi="Consolas"/>
-          <w:sz w:val="18"/>
-          <w:szCs w:val="18"/>
-        </w:rPr>
-        <w:t>조회</w:t>
+        <w:t xml:space="preserve">UserInfoUserDetails ud = userDetailsService.loadUserByUuid(uuid);    // uuid 로 조회</w:t>
       </w:r>
     </w:p>
     <w:p>
@@ -2383,7 +2312,22 @@
         <w:spacing w:after="80" w:line="272" w:lineRule="auto"/>
       </w:pPr>
       <w:r>
-        <w:t>JWT access 토큰은 서버가 상태를 기억하지 않는 stateless 방식이다. 서명만 맞으면 만료 전까지 유효하다고 판단하므로, 1단계는 다음에 손을 쓸 방법이 없었다:</w:t>
+        <w:t>JWT access 토큰은 서버가 상태를 기억하지 않는 stateless 방식이다. 서명만 맞으면 만료 전까지 유효하다고 판단하므로, 1단계</w:t>
+      </w:r>
+      <w:r>
+        <w:rPr>
+          <w:rFonts w:hint="eastAsia"/>
+        </w:rPr>
+        <w:t>에서</w:t>
+      </w:r>
+      <w:r>
+        <w:t xml:space="preserve">는 </w:t>
+      </w:r>
+      <w:r>
+        <w:rPr>
+          <w:rFonts w:hint="eastAsia"/>
+        </w:rPr>
+        <w:t>아래의 내용들을 대응하지 못하였음</w:t>
       </w:r>
     </w:p>
     <w:p>
@@ -2418,7 +2362,16 @@
         <w:spacing w:after="50" w:line="264" w:lineRule="auto"/>
       </w:pPr>
       <w:r>
-        <w:t>토큰이 탈취돼도 만료 전까지는 공격자도 정상 사용자처럼 인증된다</w:t>
+        <w:t>토큰이 탈취</w:t>
+      </w:r>
+      <w:r>
+        <w:rPr>
+          <w:rFonts w:hint="eastAsia"/>
+        </w:rPr>
+        <w:t xml:space="preserve"> 되어</w:t>
+      </w:r>
+      <w:r>
+        <w:t>도 만료 전까지는 공격자도 정상 사용자처럼 인증된다</w:t>
       </w:r>
       <w:r>
         <w:rPr>
@@ -2437,7 +2390,25 @@
         <w:spacing w:after="50" w:line="264" w:lineRule="auto"/>
       </w:pPr>
       <w:r>
-        <w:t>비밀번호를 바꾸거나 이상이 감지돼도 이미 발급된 토큰을 강제로 무효화할 수 없다</w:t>
+        <w:t>비밀번호를 바꾸거나 이상이 감지</w:t>
+      </w:r>
+      <w:r>
+        <w:rPr>
+          <w:rFonts w:hint="eastAsia"/>
+        </w:rPr>
+        <w:t xml:space="preserve"> 되어도</w:t>
+      </w:r>
+      <w:r>
+        <w:t xml:space="preserve"> 이미 발급된 토큰을 강제로 무효화</w:t>
+      </w:r>
+      <w:r>
+        <w:rPr>
+          <w:rFonts w:hint="eastAsia"/>
+        </w:rPr>
+        <w:t xml:space="preserve"> </w:t>
+      </w:r>
+      <w:r>
+        <w:t>할 수 없다</w:t>
       </w:r>
       <w:r>
         <w:rPr>
@@ -2462,10 +2433,54 @@
     </w:p>
     <w:p>
       <w:pPr>
+        <w:spacing w:line="272" w:lineRule="auto"/>
+      </w:pPr>
+      <w:r>
+        <w:t xml:space="preserve">Access </w:t>
+      </w:r>
+      <w:r>
+        <w:rPr>
+          <w:rFonts w:hint="eastAsia"/>
+        </w:rPr>
+        <w:t>To</w:t>
+      </w:r>
+      <w:r>
+        <w:t>ken: API 호출</w:t>
+      </w:r>
+      <w:r>
+        <w:rPr>
+          <w:rFonts w:hint="eastAsia"/>
+        </w:rPr>
+        <w:t>할 때 마다 사용하</w:t>
+      </w:r>
+      <w:r>
+        <w:t>는 단기 JWT, 900초(15분)로 단축</w:t>
+      </w:r>
+      <w:r>
+        <w:rPr>
+          <w:rFonts w:hint="eastAsia"/>
+        </w:rPr>
+        <w:t>함</w:t>
+      </w:r>
+      <w:r>
+        <w:t xml:space="preserve">. </w:t>
+      </w:r>
+    </w:p>
+    <w:p>
+      <w:pPr>
         <w:spacing w:after="80" w:line="272" w:lineRule="auto"/>
       </w:pPr>
       <w:r>
-        <w:t>access: 평소 API 호출마다 쓰는 단기 JWT, 900초(15분)로 단축. refresh: 서버 DB 에 저장한 무작위 불투명 문자열 — 서버가 들고 있으므로 조회·폐기·교체가 가능하다. stateless 한 access 에는 없던 "상태"를 서버 쪽에 되살리는 지점이다.</w:t>
+        <w:t>Refresh Token: 서버 DB에 저장한 무작위 불투명 문자열 — 서버</w:t>
+      </w:r>
+      <w:r>
+        <w:rPr>
+          <w:rFonts w:hint="eastAsia"/>
+        </w:rPr>
+        <w:t>에서 관리 되므로</w:t>
+      </w:r>
+      <w:r>
+        <w:t xml:space="preserve"> 조회·폐기·교체가 가능하다. stateless 한 access 에는 없던 "상태"를 서버 쪽에 되살리는 지점이다.</w:t>
       </w:r>
     </w:p>
     <w:p>
@@ -2491,7 +2506,16 @@
         <w:spacing w:after="50" w:line="264" w:lineRule="auto"/>
       </w:pPr>
       <w:r>
-        <w:t>access 만료(15분 경과) → 클라이언트가 POST /api/userinfos/refresh 에 refresh 제출</w:t>
+        <w:t xml:space="preserve">access </w:t>
+      </w:r>
+      <w:r>
+        <w:rPr>
+          <w:rFonts w:hint="eastAsia"/>
+        </w:rPr>
+        <w:t>t</w:t>
+      </w:r>
+      <w:r>
+        <w:t>ime만료(15분 경과) → 클라이언트가 POST /api/userinfos/refresh 에 refresh 제출</w:t>
       </w:r>
     </w:p>
     <w:p>
@@ -2504,7 +2528,43 @@
         <w:spacing w:after="50" w:line="264" w:lineRule="auto"/>
       </w:pPr>
       <w:r>
-        <w:t>서버가 DB 에서 유효성 확인 → 새 access + 새 refresh 발급, 기존 refresh 는 즉시 폐기(1회용 회전)</w:t>
+        <w:t>서버가 DB 에서 유효성 확인 → 새</w:t>
+      </w:r>
+      <w:r>
+        <w:rPr>
+          <w:rFonts w:hint="eastAsia"/>
+        </w:rPr>
+        <w:t>로운</w:t>
+      </w:r>
+      <w:r>
+        <w:t xml:space="preserve"> access </w:t>
+      </w:r>
+      <w:r>
+        <w:rPr>
+          <w:rFonts w:hint="eastAsia"/>
+        </w:rPr>
+        <w:t>t</w:t>
+      </w:r>
+      <w:r>
+        <w:t>oken + 새</w:t>
+      </w:r>
+      <w:r>
+        <w:rPr>
+          <w:rFonts w:hint="eastAsia"/>
+        </w:rPr>
+        <w:t>로운</w:t>
+      </w:r>
+      <w:r>
+        <w:t xml:space="preserve"> refresh token발급, 기존 refresh token</w:t>
+      </w:r>
+      <w:r>
+        <w:rPr>
+          <w:rFonts w:hint="eastAsia"/>
+        </w:rPr>
+        <w:t>은</w:t>
+      </w:r>
+      <w:r>
+        <w:t xml:space="preserve"> 즉시 폐기(1회용 회전)</w:t>
       </w:r>
     </w:p>
     <w:p>
@@ -2534,111 +2594,7 @@
           <w:sz w:val="18"/>
           <w:szCs w:val="18"/>
         </w:rPr>
-        <w:t xml:space="preserve">// </w:t>
-      </w:r>
-      <w:r>
-        <w:rPr>
-          <w:rFonts w:ascii="Consolas" w:hAnsi="Consolas"/>
-          <w:sz w:val="18"/>
-          <w:szCs w:val="18"/>
-        </w:rPr>
-        <w:t>회전</w:t>
-      </w:r>
-      <w:r>
-        <w:rPr>
-          <w:rFonts w:ascii="Consolas" w:hAnsi="Consolas"/>
-          <w:sz w:val="18"/>
-          <w:szCs w:val="18"/>
-        </w:rPr>
-        <w:t xml:space="preserve">(RefreshTokenService.rotate): </w:t>
-      </w:r>
-      <w:r>
-        <w:rPr>
-          <w:rFonts w:ascii="Consolas" w:hAnsi="Consolas"/>
-          <w:sz w:val="18"/>
-          <w:szCs w:val="18"/>
-        </w:rPr>
-        <w:t>유효하면</w:t>
-      </w:r>
-      <w:r>
-        <w:rPr>
-          <w:rFonts w:ascii="Consolas" w:hAnsi="Consolas"/>
-          <w:sz w:val="18"/>
-          <w:szCs w:val="18"/>
-        </w:rPr>
-        <w:t xml:space="preserve"> </w:t>
-      </w:r>
-      <w:r>
-        <w:rPr>
-          <w:rFonts w:ascii="Consolas" w:hAnsi="Consolas"/>
-          <w:sz w:val="18"/>
-          <w:szCs w:val="18"/>
-        </w:rPr>
-        <w:t>폐기</w:t>
-      </w:r>
-      <w:r>
-        <w:rPr>
-          <w:rFonts w:ascii="Consolas" w:hAnsi="Consolas"/>
-          <w:sz w:val="18"/>
-          <w:szCs w:val="18"/>
-        </w:rPr>
-        <w:t xml:space="preserve"> </w:t>
-      </w:r>
-      <w:r>
-        <w:rPr>
-          <w:rFonts w:ascii="Consolas" w:hAnsi="Consolas"/>
-          <w:sz w:val="18"/>
-          <w:szCs w:val="18"/>
-        </w:rPr>
-        <w:t>후</w:t>
-      </w:r>
-      <w:r>
-        <w:rPr>
-          <w:rFonts w:ascii="Consolas" w:hAnsi="Consolas"/>
-          <w:sz w:val="18"/>
-          <w:szCs w:val="18"/>
-        </w:rPr>
-        <w:t xml:space="preserve"> </w:t>
-      </w:r>
-      <w:r>
-        <w:rPr>
-          <w:rFonts w:ascii="Consolas" w:hAnsi="Consolas"/>
-          <w:sz w:val="18"/>
-          <w:szCs w:val="18"/>
-        </w:rPr>
-        <w:t>새</w:t>
-      </w:r>
-      <w:r>
-        <w:rPr>
-          <w:rFonts w:ascii="Consolas" w:hAnsi="Consolas"/>
-          <w:sz w:val="18"/>
-          <w:szCs w:val="18"/>
-        </w:rPr>
-        <w:t xml:space="preserve"> </w:t>
-      </w:r>
-      <w:r>
-        <w:rPr>
-          <w:rFonts w:ascii="Consolas" w:hAnsi="Consolas"/>
-          <w:sz w:val="18"/>
-          <w:szCs w:val="18"/>
-        </w:rPr>
-        <w:t>토큰</w:t>
-      </w:r>
-      <w:r>
-        <w:rPr>
-          <w:rFonts w:ascii="Consolas" w:hAnsi="Consolas"/>
-          <w:sz w:val="18"/>
-          <w:szCs w:val="18"/>
-        </w:rPr>
-        <w:t xml:space="preserve"> </w:t>
-      </w:r>
-      <w:r>
-        <w:rPr>
-          <w:rFonts w:ascii="Consolas" w:hAnsi="Consolas"/>
-          <w:sz w:val="18"/>
-          <w:szCs w:val="18"/>
-        </w:rPr>
-        <w:t>발급</w:t>
+        <w:t xml:space="preserve">// 회전(RefreshTokenService.rotate): 유효하면 폐기 후 새 토큰 발급</w:t>
       </w:r>
     </w:p>
     <w:p>
@@ -2670,39 +2626,7 @@
           <w:sz w:val="18"/>
           <w:szCs w:val="18"/>
         </w:rPr>
-        <w:t xml:space="preserve">        .orElseThrow(() -&gt; new BadCredentialsException("</w:t>
-      </w:r>
-      <w:r>
-        <w:rPr>
-          <w:rFonts w:ascii="Consolas" w:hAnsi="Consolas"/>
-          <w:sz w:val="18"/>
-          <w:szCs w:val="18"/>
-        </w:rPr>
-        <w:t>유효하지</w:t>
-      </w:r>
-      <w:r>
-        <w:rPr>
-          <w:rFonts w:ascii="Consolas" w:hAnsi="Consolas"/>
-          <w:sz w:val="18"/>
-          <w:szCs w:val="18"/>
-        </w:rPr>
-        <w:t xml:space="preserve"> </w:t>
-      </w:r>
-      <w:r>
-        <w:rPr>
-          <w:rFonts w:ascii="Consolas" w:hAnsi="Consolas"/>
-          <w:sz w:val="18"/>
-          <w:szCs w:val="18"/>
-        </w:rPr>
-        <w:t>않은</w:t>
-      </w:r>
-      <w:r>
-        <w:rPr>
-          <w:rFonts w:ascii="Consolas" w:hAnsi="Consolas"/>
-          <w:sz w:val="18"/>
-          <w:szCs w:val="18"/>
-        </w:rPr>
-        <w:t xml:space="preserve"> refresh"));</w:t>
+        <w:t xml:space="preserve">        .orElseThrow(() -&gt; new BadCredentialsException("유효하지 않은 refresh"));</w:t>
       </w:r>
     </w:p>
     <w:p>
@@ -2718,47 +2642,7 @@
           <w:sz w:val="18"/>
           <w:szCs w:val="18"/>
         </w:rPr>
-        <w:t>repository.delete(rt);          // 1</w:t>
-      </w:r>
-      <w:r>
-        <w:rPr>
-          <w:rFonts w:ascii="Consolas" w:hAnsi="Consolas"/>
-          <w:sz w:val="18"/>
-          <w:szCs w:val="18"/>
-        </w:rPr>
-        <w:t>회용</w:t>
-      </w:r>
-      <w:r>
-        <w:rPr>
-          <w:rFonts w:ascii="Consolas" w:hAnsi="Consolas"/>
-          <w:sz w:val="18"/>
-          <w:szCs w:val="18"/>
-        </w:rPr>
-        <w:t xml:space="preserve"> → </w:t>
-      </w:r>
-      <w:r>
-        <w:rPr>
-          <w:rFonts w:ascii="Consolas" w:hAnsi="Consolas"/>
-          <w:sz w:val="18"/>
-          <w:szCs w:val="18"/>
-        </w:rPr>
-        <w:t>즉시</w:t>
-      </w:r>
-      <w:r>
-        <w:rPr>
-          <w:rFonts w:ascii="Consolas" w:hAnsi="Consolas"/>
-          <w:sz w:val="18"/>
-          <w:szCs w:val="18"/>
-        </w:rPr>
-        <w:t xml:space="preserve"> </w:t>
-      </w:r>
-      <w:r>
-        <w:rPr>
-          <w:rFonts w:ascii="Consolas" w:hAnsi="Consolas"/>
-          <w:sz w:val="18"/>
-          <w:szCs w:val="18"/>
-        </w:rPr>
-        <w:t>폐기</w:t>
+        <w:t xml:space="preserve">repository.delete(rt);          // 1회용 → 즉시 폐기</w:t>
       </w:r>
     </w:p>
     <w:p>
@@ -2775,72 +2659,248 @@
           <w:sz w:val="18"/>
           <w:szCs w:val="18"/>
         </w:rPr>
-        <w:t xml:space="preserve">return issue(rt.getUserUuid()); // </w:t>
-      </w:r>
-      <w:r>
-        <w:rPr>
-          <w:rFonts w:ascii="Consolas" w:hAnsi="Consolas"/>
-          <w:sz w:val="18"/>
-          <w:szCs w:val="18"/>
-        </w:rPr>
-        <w:t>새</w:t>
-      </w:r>
-      <w:r>
-        <w:rPr>
-          <w:rFonts w:ascii="Consolas" w:hAnsi="Consolas"/>
-          <w:sz w:val="18"/>
-          <w:szCs w:val="18"/>
-        </w:rPr>
-        <w:t xml:space="preserve"> refresh </w:t>
-      </w:r>
-      <w:r>
-        <w:rPr>
-          <w:rFonts w:ascii="Consolas" w:hAnsi="Consolas"/>
-          <w:sz w:val="18"/>
-          <w:szCs w:val="18"/>
-        </w:rPr>
-        <w:t>발급</w:t>
-      </w:r>
-      <w:r>
-        <w:rPr>
-          <w:rFonts w:ascii="Consolas" w:hAnsi="Consolas"/>
-          <w:sz w:val="18"/>
-          <w:szCs w:val="18"/>
-        </w:rPr>
-        <w:t>(</w:t>
-      </w:r>
-      <w:r>
-        <w:rPr>
-          <w:rFonts w:ascii="Consolas" w:hAnsi="Consolas"/>
-          <w:sz w:val="18"/>
-          <w:szCs w:val="18"/>
-        </w:rPr>
-        <w:t>회전</w:t>
-      </w:r>
-      <w:r>
-        <w:rPr>
-          <w:rFonts w:ascii="Consolas" w:hAnsi="Consolas"/>
-          <w:sz w:val="18"/>
-          <w:szCs w:val="18"/>
-        </w:rPr>
-        <w:t>)</w:t>
+        <w:t xml:space="preserve">return issue(rt.getUserUuid()); // 새 refresh 발급(회전)</w:t>
       </w:r>
     </w:p>
     <w:p>
       <w:pPr>
         <w:spacing w:after="80" w:line="272" w:lineRule="auto"/>
         <w:rPr>
-          <w:sz w:val="18"/>
-          <w:szCs w:val="18"/>
-        </w:rPr>
-      </w:pPr>
-      <w:r>
-        <w:rPr>
           <w:iCs/>
-          <w:sz w:val="18"/>
-          <w:szCs w:val="18"/>
-        </w:rPr>
-        <w:t>참고 — refresh 토큰 수명은 보통 얼마로 두나? 일반적인 웹 서비스는 1~4주(이 앱은 14일, jwt.refresh-expire-seconds) 정도를 많이 쓰고, 금융 등 고보안 서비스는 몇 시간~며칠로 더 짧게, 모바일 앱은 30~90일 이상으로 더 길게 두기도 한다. 다만 이 앱의 rotate() 는 갱신할 때마다 issue() 를 다시 호출해 만료 시각을 "지금부터 14일"로 매번 리셋한다 — 고정 만료가 아니라 활동 기반(sliding) 만료다. 사용자가 14일 안에 한 번이라도 쓰면 세션은 사실상 끊기지 않고 연장된다(탈취된 토큰도 마찬가지로 연장되지만, 회전+재사용 탐지가 이를 어느 정도 상쇄한다). 더 엄격하게 제한하려면 활동과 무관하게 N일 후 무조건 재로그인시키는 절대 만료를 sliding 위에 추가할 수 있다(이 앱에는 없음).</w:t>
+          <w:sz w:val="22"/>
+          <w:szCs w:val="22"/>
+        </w:rPr>
+      </w:pPr>
+      <w:r>
+        <w:rPr>
+          <w:iCs/>
+          <w:sz w:val="22"/>
+          <w:szCs w:val="22"/>
+        </w:rPr>
+        <w:t xml:space="preserve">참고 — Refresh 토큰 수명은 보통 얼마로 </w:t>
+      </w:r>
+      <w:r>
+        <w:rPr>
+          <w:rFonts w:hint="eastAsia"/>
+          <w:iCs/>
+          <w:sz w:val="22"/>
+          <w:szCs w:val="22"/>
+        </w:rPr>
+        <w:t>설정 하나요</w:t>
+      </w:r>
+      <w:r>
+        <w:rPr>
+          <w:iCs/>
+          <w:sz w:val="22"/>
+          <w:szCs w:val="22"/>
+        </w:rPr>
+        <w:t xml:space="preserve">? </w:t>
+      </w:r>
+    </w:p>
+    <w:p>
+      <w:pPr>
+        <w:spacing w:after="80" w:line="272" w:lineRule="auto"/>
+        <w:rPr>
+          <w:sz w:val="18"/>
+          <w:szCs w:val="18"/>
+        </w:rPr>
+      </w:pPr>
+      <w:r>
+        <w:rPr>
+          <w:iCs/>
+          <w:sz w:val="18"/>
+          <w:szCs w:val="18"/>
+        </w:rPr>
+        <w:t>일반적인 웹 서비스는 1~4주(이 앱은 14일, jwt.refresh-expire-seconds) 정도를 많이 쓰고, 금융 등 고보안 서비스는 몇 시간~며칠로 더 짧게, 모바일 앱은 30~90일 이상으로 더 길게 두기도 한다. 다만 이 앱의 rotate() 는 갱신</w:t>
+      </w:r>
+      <w:r>
+        <w:rPr>
+          <w:rFonts w:hint="eastAsia"/>
+          <w:iCs/>
+          <w:sz w:val="18"/>
+          <w:szCs w:val="18"/>
+        </w:rPr>
+        <w:t xml:space="preserve"> </w:t>
+      </w:r>
+      <w:r>
+        <w:rPr>
+          <w:iCs/>
+          <w:sz w:val="18"/>
+          <w:szCs w:val="18"/>
+        </w:rPr>
+        <w:t>할 때</w:t>
+      </w:r>
+      <w:r>
+        <w:rPr>
+          <w:rFonts w:hint="eastAsia"/>
+          <w:iCs/>
+          <w:sz w:val="18"/>
+          <w:szCs w:val="18"/>
+        </w:rPr>
+        <w:t xml:space="preserve"> </w:t>
+      </w:r>
+      <w:r>
+        <w:rPr>
+          <w:iCs/>
+          <w:sz w:val="18"/>
+          <w:szCs w:val="18"/>
+        </w:rPr>
+        <w:t>마다 issue() 를 다시 호출해 만료 시각을 "지금부터 14일"로 매번 리셋</w:t>
+      </w:r>
+      <w:r>
+        <w:rPr>
+          <w:rFonts w:hint="eastAsia"/>
+          <w:iCs/>
+          <w:sz w:val="18"/>
+          <w:szCs w:val="18"/>
+        </w:rPr>
+        <w:t xml:space="preserve"> </w:t>
+      </w:r>
+      <w:r>
+        <w:rPr>
+          <w:iCs/>
+          <w:sz w:val="18"/>
+          <w:szCs w:val="18"/>
+        </w:rPr>
+        <w:t>한다 — 고정</w:t>
+      </w:r>
+      <w:r>
+        <w:rPr>
+          <w:rFonts w:hint="eastAsia"/>
+          <w:iCs/>
+          <w:sz w:val="18"/>
+          <w:szCs w:val="18"/>
+        </w:rPr>
+        <w:t>된</w:t>
+      </w:r>
+      <w:r>
+        <w:rPr>
+          <w:iCs/>
+          <w:sz w:val="18"/>
+          <w:szCs w:val="18"/>
+        </w:rPr>
+        <w:t xml:space="preserve"> 만료가 아니라 활동</w:t>
+      </w:r>
+      <w:r>
+        <w:rPr>
+          <w:rFonts w:hint="eastAsia"/>
+          <w:iCs/>
+          <w:sz w:val="18"/>
+          <w:szCs w:val="18"/>
+        </w:rPr>
+        <w:t xml:space="preserve"> </w:t>
+      </w:r>
+      <w:r>
+        <w:rPr>
+          <w:iCs/>
+          <w:sz w:val="18"/>
+          <w:szCs w:val="18"/>
+        </w:rPr>
+        <w:t>기반 (sliding) 만료다. 사용자가 14일 안에 한 번이라도 쓰면 세션은 사실상 끊기지 않고 연장</w:t>
+      </w:r>
+      <w:r>
+        <w:rPr>
+          <w:rFonts w:hint="eastAsia"/>
+          <w:iCs/>
+          <w:sz w:val="18"/>
+          <w:szCs w:val="18"/>
+        </w:rPr>
+        <w:t xml:space="preserve"> </w:t>
+      </w:r>
+      <w:r>
+        <w:rPr>
+          <w:iCs/>
+          <w:sz w:val="18"/>
+          <w:szCs w:val="18"/>
+        </w:rPr>
+        <w:t>된다(탈취된 토큰도 마찬가지로 연장</w:t>
+      </w:r>
+      <w:r>
+        <w:rPr>
+          <w:rFonts w:hint="eastAsia"/>
+          <w:iCs/>
+          <w:sz w:val="18"/>
+          <w:szCs w:val="18"/>
+        </w:rPr>
+        <w:t xml:space="preserve"> </w:t>
+      </w:r>
+      <w:r>
+        <w:rPr>
+          <w:iCs/>
+          <w:sz w:val="18"/>
+          <w:szCs w:val="18"/>
+        </w:rPr>
+        <w:t>되지만, 회전+재사용 탐지가 이를 어느 정도 상쇄한다). 더 엄격하게 제한하려면 활동과 무관하게 N일 후 무조건 재</w:t>
+      </w:r>
+      <w:r>
+        <w:rPr>
+          <w:rFonts w:hint="eastAsia"/>
+          <w:iCs/>
+          <w:sz w:val="18"/>
+          <w:szCs w:val="18"/>
+        </w:rPr>
+        <w:t xml:space="preserve"> </w:t>
+      </w:r>
+      <w:r>
+        <w:rPr>
+          <w:iCs/>
+          <w:sz w:val="18"/>
+          <w:szCs w:val="18"/>
+        </w:rPr>
+        <w:t>로그인</w:t>
+      </w:r>
+      <w:r>
+        <w:rPr>
+          <w:rFonts w:hint="eastAsia"/>
+          <w:iCs/>
+          <w:sz w:val="18"/>
+          <w:szCs w:val="18"/>
+        </w:rPr>
+        <w:t xml:space="preserve"> </w:t>
+      </w:r>
+      <w:r>
+        <w:rPr>
+          <w:iCs/>
+          <w:sz w:val="18"/>
+          <w:szCs w:val="18"/>
+        </w:rPr>
+        <w:t>시키는 절대 만료를 sliding 위에 추가할 수 있다</w:t>
+      </w:r>
+      <w:r>
+        <w:rPr>
+          <w:rFonts w:hint="eastAsia"/>
+          <w:iCs/>
+          <w:sz w:val="18"/>
+          <w:szCs w:val="18"/>
+        </w:rPr>
+        <w:t>.</w:t>
+      </w:r>
+      <w:r>
+        <w:rPr>
+          <w:iCs/>
+          <w:sz w:val="18"/>
+          <w:szCs w:val="18"/>
+        </w:rPr>
+        <w:t xml:space="preserve"> (이 앱에는 없음).</w:t>
+      </w:r>
+    </w:p>
+    <w:p>
+      <w:pPr>
+        <w:rPr>
+          <w:b/>
+          <w:bCs/>
+          <w:color w:val="2E5496"/>
+          <w:sz w:val="24"/>
+          <w:szCs w:val="24"/>
+        </w:rPr>
+      </w:pPr>
+      <w:r>
+        <w:rPr>
+          <w:b/>
+          <w:bCs/>
+          <w:color w:val="2E5496"/>
+        </w:rPr>
+        <w:br w:type="page"/>
       </w:r>
     </w:p>
     <w:p>
@@ -2854,6 +2914,7 @@
           <w:bCs/>
           <w:color w:val="2E5496"/>
         </w:rPr>
+        <w:lastRenderedPageBreak/>
         <w:t>4-3. 이 구조로 얻는 것 — 구체적 이점</w:t>
       </w:r>
     </w:p>
@@ -2871,21 +2932,21 @@
         <w:tblLook w:val="04A0" w:firstRow="1" w:lastRow="0" w:firstColumn="1" w:lastColumn="0" w:noHBand="0" w:noVBand="1"/>
       </w:tblPr>
       <w:tblGrid>
-        <w:gridCol w:w="2059"/>
-        <w:gridCol w:w="354"/>
-        <w:gridCol w:w="3306"/>
-        <w:gridCol w:w="2573"/>
-        <w:gridCol w:w="708"/>
+        <w:gridCol w:w="2051"/>
+        <w:gridCol w:w="496"/>
+        <w:gridCol w:w="3144"/>
+        <w:gridCol w:w="2590"/>
+        <w:gridCol w:w="719"/>
       </w:tblGrid>
       <w:tr>
         <w:trPr>
           <w:gridAfter w:val="1"/>
-          <w:wAfter w:w="800" w:type="dxa"/>
+          <w:wAfter w:w="719" w:type="dxa"/>
           <w:tblHeader/>
         </w:trPr>
         <w:tc>
           <w:tcPr>
-            <w:tcW w:w="2200" w:type="dxa"/>
+            <w:tcW w:w="2051" w:type="dxa"/>
             <w:shd w:val="clear" w:color="auto" w:fill="2E5496"/>
             <w:tcMar>
               <w:top w:w="40" w:type="dxa"/>
@@ -2909,7 +2970,7 @@
         </w:tc>
         <w:tc>
           <w:tcPr>
-            <w:tcW w:w="6800" w:type="dxa"/>
+            <w:tcW w:w="6230" w:type="dxa"/>
             <w:gridSpan w:val="3"/>
             <w:shd w:val="clear" w:color="auto" w:fill="2E5496"/>
             <w:tcMar>
@@ -2936,11 +2997,11 @@
       <w:tr>
         <w:trPr>
           <w:gridAfter w:val="1"/>
-          <w:wAfter w:w="800" w:type="dxa"/>
+          <w:wAfter w:w="719" w:type="dxa"/>
         </w:trPr>
         <w:tc>
           <w:tcPr>
-            <w:tcW w:w="2200" w:type="dxa"/>
+            <w:tcW w:w="2051" w:type="dxa"/>
             <w:tcMar>
               <w:top w:w="40" w:type="dxa"/>
               <w:left w:w="80" w:type="dxa"/>
@@ -2960,7 +3021,7 @@
         </w:tc>
         <w:tc>
           <w:tcPr>
-            <w:tcW w:w="6800" w:type="dxa"/>
+            <w:tcW w:w="6230" w:type="dxa"/>
             <w:gridSpan w:val="3"/>
             <w:tcMar>
               <w:top w:w="40" w:type="dxa"/>
@@ -3020,7 +3081,52 @@
                 <w:sz w:val="18"/>
                 <w:szCs w:val="18"/>
               </w:rPr>
-              <w:t xml:space="preserve"> 최대 15분이면 무력화된다(1단계는 60분간 무방비)</w:t>
+              <w:t xml:space="preserve"> 최대 15분이면 무력화</w:t>
+            </w:r>
+            <w:r>
+              <w:rPr>
+                <w:rFonts w:hint="eastAsia"/>
+                <w:sz w:val="18"/>
+                <w:szCs w:val="18"/>
+              </w:rPr>
+              <w:t xml:space="preserve"> </w:t>
+            </w:r>
+            <w:r>
+              <w:rPr>
+                <w:sz w:val="18"/>
+                <w:szCs w:val="18"/>
+              </w:rPr>
+              <w:t>된다</w:t>
+            </w:r>
+            <w:r>
+              <w:rPr>
+                <w:rFonts w:hint="eastAsia"/>
+                <w:sz w:val="18"/>
+                <w:szCs w:val="18"/>
+              </w:rPr>
+              <w:t xml:space="preserve"> </w:t>
+            </w:r>
+            <w:r>
+              <w:rPr>
+                <w:sz w:val="18"/>
+                <w:szCs w:val="18"/>
+              </w:rPr>
+              <w:t>(1단계</w:t>
+            </w:r>
+            <w:r>
+              <w:rPr>
+                <w:rFonts w:hint="eastAsia"/>
+                <w:sz w:val="18"/>
+                <w:szCs w:val="18"/>
+              </w:rPr>
+              <w:t>에서</w:t>
+            </w:r>
+            <w:r>
+              <w:rPr>
+                <w:sz w:val="18"/>
+                <w:szCs w:val="18"/>
+              </w:rPr>
+              <w:t>는 60분)</w:t>
             </w:r>
           </w:p>
         </w:tc>
@@ -3028,11 +3134,11 @@
       <w:tr>
         <w:trPr>
           <w:gridAfter w:val="1"/>
-          <w:wAfter w:w="800" w:type="dxa"/>
+          <w:wAfter w:w="719" w:type="dxa"/>
         </w:trPr>
         <w:tc>
           <w:tcPr>
-            <w:tcW w:w="2200" w:type="dxa"/>
+            <w:tcW w:w="2051" w:type="dxa"/>
             <w:tcMar>
               <w:top w:w="40" w:type="dxa"/>
               <w:left w:w="80" w:type="dxa"/>
@@ -3052,7 +3158,7 @@
         </w:tc>
         <w:tc>
           <w:tcPr>
-            <w:tcW w:w="6800" w:type="dxa"/>
+            <w:tcW w:w="6230" w:type="dxa"/>
             <w:gridSpan w:val="3"/>
             <w:tcMar>
               <w:top w:w="40" w:type="dxa"/>
@@ -3067,7 +3173,37 @@
                 <w:sz w:val="18"/>
                 <w:szCs w:val="18"/>
               </w:rPr>
-              <w:t>refresh 는 DB 에 있으므로 로그아웃 시 즉시 삭제 → 그 세션은 더 갱신될 수 없다</w:t>
+              <w:t xml:space="preserve">refresh </w:t>
+            </w:r>
+            <w:r>
+              <w:rPr>
+                <w:rFonts w:hint="eastAsia"/>
+                <w:sz w:val="18"/>
+                <w:szCs w:val="18"/>
+              </w:rPr>
+              <w:t>t</w:t>
+            </w:r>
+            <w:r>
+              <w:rPr>
+                <w:sz w:val="18"/>
+                <w:szCs w:val="18"/>
+              </w:rPr>
+              <w:t>oken</w:t>
+            </w:r>
+            <w:r>
+              <w:rPr>
+                <w:rFonts w:hint="eastAsia"/>
+                <w:sz w:val="18"/>
+                <w:szCs w:val="18"/>
+              </w:rPr>
+              <w:t>은</w:t>
+            </w:r>
+            <w:r>
+              <w:rPr>
+                <w:sz w:val="18"/>
+                <w:szCs w:val="18"/>
+              </w:rPr>
+              <w:t xml:space="preserve"> DB 에 있으므로 로그아웃 시 즉시 삭제 → 그 세션은 더 갱신될 수 없다</w:t>
             </w:r>
           </w:p>
         </w:tc>
@@ -3075,32 +3211,31 @@
       <w:tr>
         <w:trPr>
           <w:gridAfter w:val="1"/>
-          <w:wAfter w:w="800" w:type="dxa"/>
+          <w:wAfter w:w="719" w:type="dxa"/>
         </w:trPr>
         <w:tc>
           <w:tcPr>
-            <w:tcW w:w="2200" w:type="dxa"/>
-            <w:tcMar>
-              <w:top w:w="40" w:type="dxa"/>
-              <w:left w:w="80" w:type="dxa"/>
-              <w:bottom w:w="40" w:type="dxa"/>
-              <w:right w:w="80" w:type="dxa"/>
-            </w:tcMar>
-          </w:tcPr>
-          <w:p>
-            <w:r>
-              <w:rPr>
-                <w:sz w:val="18"/>
-                <w:szCs w:val="18"/>
-              </w:rPr>
-              <w:lastRenderedPageBreak/>
+            <w:tcW w:w="2051" w:type="dxa"/>
+            <w:tcMar>
+              <w:top w:w="40" w:type="dxa"/>
+              <w:left w:w="80" w:type="dxa"/>
+              <w:bottom w:w="40" w:type="dxa"/>
+              <w:right w:w="80" w:type="dxa"/>
+            </w:tcMar>
+          </w:tcPr>
+          <w:p>
+            <w:r>
+              <w:rPr>
+                <w:sz w:val="18"/>
+                <w:szCs w:val="18"/>
+              </w:rPr>
               <w:t>탈취·재사용 탐지의 기반(회전)</w:t>
             </w:r>
           </w:p>
         </w:tc>
         <w:tc>
           <w:tcPr>
-            <w:tcW w:w="6800" w:type="dxa"/>
+            <w:tcW w:w="6230" w:type="dxa"/>
             <w:gridSpan w:val="3"/>
             <w:tcMar>
               <w:top w:w="40" w:type="dxa"/>
@@ -3123,11 +3258,11 @@
       <w:tr>
         <w:trPr>
           <w:gridAfter w:val="1"/>
-          <w:wAfter w:w="800" w:type="dxa"/>
+          <w:wAfter w:w="719" w:type="dxa"/>
         </w:trPr>
         <w:tc>
           <w:tcPr>
-            <w:tcW w:w="2200" w:type="dxa"/>
+            <w:tcW w:w="2051" w:type="dxa"/>
             <w:tcMar>
               <w:top w:w="40" w:type="dxa"/>
               <w:left w:w="80" w:type="dxa"/>
@@ -3147,7 +3282,7 @@
         </w:tc>
         <w:tc>
           <w:tcPr>
-            <w:tcW w:w="6800" w:type="dxa"/>
+            <w:tcW w:w="6230" w:type="dxa"/>
             <w:gridSpan w:val="3"/>
             <w:tcMar>
               <w:top w:w="40" w:type="dxa"/>
@@ -3162,7 +3297,37 @@
                 <w:sz w:val="18"/>
                 <w:szCs w:val="18"/>
               </w:rPr>
-              <w:t>access 가 짧아져도 자동 갱신</w:t>
+              <w:t xml:space="preserve">access </w:t>
+            </w:r>
+            <w:r>
+              <w:rPr>
+                <w:rFonts w:hint="eastAsia"/>
+                <w:sz w:val="18"/>
+                <w:szCs w:val="18"/>
+              </w:rPr>
+              <w:t>t</w:t>
+            </w:r>
+            <w:r>
+              <w:rPr>
+                <w:sz w:val="18"/>
+                <w:szCs w:val="18"/>
+              </w:rPr>
+              <w:t>ime</w:t>
+            </w:r>
+            <w:r>
+              <w:rPr>
+                <w:rFonts w:hint="eastAsia"/>
+                <w:sz w:val="18"/>
+                <w:szCs w:val="18"/>
+              </w:rPr>
+              <w:t>이</w:t>
+            </w:r>
+            <w:r>
+              <w:rPr>
+                <w:sz w:val="18"/>
+                <w:szCs w:val="18"/>
+              </w:rPr>
+              <w:t xml:space="preserve"> 짧아져도 자동 갱신</w:t>
             </w:r>
             <w:r>
               <w:rPr>
@@ -3185,11 +3350,11 @@
       <w:tr>
         <w:trPr>
           <w:gridAfter w:val="1"/>
-          <w:wAfter w:w="800" w:type="dxa"/>
+          <w:wAfter w:w="719" w:type="dxa"/>
         </w:trPr>
         <w:tc>
           <w:tcPr>
-            <w:tcW w:w="2200" w:type="dxa"/>
+            <w:tcW w:w="2051" w:type="dxa"/>
             <w:tcMar>
               <w:top w:w="40" w:type="dxa"/>
               <w:left w:w="80" w:type="dxa"/>
@@ -3209,7 +3374,7 @@
         </w:tc>
         <w:tc>
           <w:tcPr>
-            <w:tcW w:w="6800" w:type="dxa"/>
+            <w:tcW w:w="6230" w:type="dxa"/>
             <w:gridSpan w:val="3"/>
             <w:tcMar>
               <w:top w:w="40" w:type="dxa"/>
@@ -3224,7 +3389,37 @@
                 <w:sz w:val="18"/>
                 <w:szCs w:val="18"/>
               </w:rPr>
-              <w:t>서버가 refresh 를 DB 로 보유 → "모든 기기 로그아웃" 등으로 확장 가능(이번 범위 밖)</w:t>
+              <w:t xml:space="preserve">서버가 refresh </w:t>
+            </w:r>
+            <w:r>
+              <w:rPr>
+                <w:rFonts w:hint="eastAsia"/>
+                <w:sz w:val="18"/>
+                <w:szCs w:val="18"/>
+              </w:rPr>
+              <w:t>t</w:t>
+            </w:r>
+            <w:r>
+              <w:rPr>
+                <w:sz w:val="18"/>
+                <w:szCs w:val="18"/>
+              </w:rPr>
+              <w:t>oken</w:t>
+            </w:r>
+            <w:r>
+              <w:rPr>
+                <w:rFonts w:hint="eastAsia"/>
+                <w:sz w:val="18"/>
+                <w:szCs w:val="18"/>
+              </w:rPr>
+              <w:t>을</w:t>
+            </w:r>
+            <w:r>
+              <w:rPr>
+                <w:sz w:val="18"/>
+                <w:szCs w:val="18"/>
+              </w:rPr>
+              <w:t xml:space="preserve"> DB 로 보유 → "모든 기기 로그아웃" 등으로 확장 가능(이번 범위 밖)</w:t>
             </w:r>
           </w:p>
         </w:tc>
@@ -3235,7 +3430,7 @@
         </w:trPr>
         <w:tc>
           <w:tcPr>
-            <w:tcW w:w="2600" w:type="dxa"/>
+            <w:tcW w:w="2547" w:type="dxa"/>
             <w:gridSpan w:val="2"/>
             <w:shd w:val="clear" w:color="auto" w:fill="2E5496"/>
             <w:tcMar>
@@ -3249,7 +3444,7 @@
         </w:tc>
         <w:tc>
           <w:tcPr>
-            <w:tcW w:w="3600" w:type="dxa"/>
+            <w:tcW w:w="3144" w:type="dxa"/>
             <w:shd w:val="clear" w:color="auto" w:fill="2E5496"/>
             <w:tcMar>
               <w:top w:w="40" w:type="dxa"/>
@@ -3273,7 +3468,7 @@
         </w:tc>
         <w:tc>
           <w:tcPr>
-            <w:tcW w:w="3600" w:type="dxa"/>
+            <w:tcW w:w="3309" w:type="dxa"/>
             <w:gridSpan w:val="2"/>
             <w:shd w:val="clear" w:color="auto" w:fill="2E5496"/>
             <w:tcMar>
@@ -3300,7 +3495,7 @@
       <w:tr>
         <w:tc>
           <w:tcPr>
-            <w:tcW w:w="2600" w:type="dxa"/>
+            <w:tcW w:w="2547" w:type="dxa"/>
             <w:gridSpan w:val="2"/>
             <w:tcMar>
               <w:top w:w="40" w:type="dxa"/>
@@ -3321,7 +3516,7 @@
         </w:tc>
         <w:tc>
           <w:tcPr>
-            <w:tcW w:w="3600" w:type="dxa"/>
+            <w:tcW w:w="3144" w:type="dxa"/>
             <w:tcMar>
               <w:top w:w="40" w:type="dxa"/>
               <w:left w:w="80" w:type="dxa"/>
@@ -3341,7 +3536,7 @@
         </w:tc>
         <w:tc>
           <w:tcPr>
-            <w:tcW w:w="3600" w:type="dxa"/>
+            <w:tcW w:w="3309" w:type="dxa"/>
             <w:gridSpan w:val="2"/>
             <w:tcMar>
               <w:top w:w="40" w:type="dxa"/>
@@ -3379,7 +3574,7 @@
       <w:tr>
         <w:tc>
           <w:tcPr>
-            <w:tcW w:w="2600" w:type="dxa"/>
+            <w:tcW w:w="2547" w:type="dxa"/>
             <w:gridSpan w:val="2"/>
             <w:tcMar>
               <w:top w:w="40" w:type="dxa"/>
@@ -3394,13 +3589,28 @@
                 <w:sz w:val="18"/>
                 <w:szCs w:val="18"/>
               </w:rPr>
-              <w:t>사용자가 로그아웃하면?</w:t>
-            </w:r>
-          </w:p>
-        </w:tc>
-        <w:tc>
-          <w:tcPr>
-            <w:tcW w:w="3600" w:type="dxa"/>
+              <w:t>사용자가 로그아웃</w:t>
+            </w:r>
+            <w:r>
+              <w:rPr>
+                <w:rFonts w:hint="eastAsia"/>
+                <w:sz w:val="18"/>
+                <w:szCs w:val="18"/>
+              </w:rPr>
+              <w:t xml:space="preserve"> </w:t>
+            </w:r>
+            <w:r>
+              <w:rPr>
+                <w:sz w:val="18"/>
+                <w:szCs w:val="18"/>
+              </w:rPr>
+              <w:t>하면?</w:t>
+            </w:r>
+          </w:p>
+        </w:tc>
+        <w:tc>
+          <w:tcPr>
+            <w:tcW w:w="3144" w:type="dxa"/>
             <w:tcMar>
               <w:top w:w="40" w:type="dxa"/>
               <w:left w:w="80" w:type="dxa"/>
@@ -3428,7 +3638,7 @@
         </w:tc>
         <w:tc>
           <w:tcPr>
-            <w:tcW w:w="3600" w:type="dxa"/>
+            <w:tcW w:w="3309" w:type="dxa"/>
             <w:gridSpan w:val="2"/>
             <w:tcMar>
               <w:top w:w="40" w:type="dxa"/>
@@ -3451,7 +3661,7 @@
       <w:tr>
         <w:tc>
           <w:tcPr>
-            <w:tcW w:w="2600" w:type="dxa"/>
+            <w:tcW w:w="2547" w:type="dxa"/>
             <w:gridSpan w:val="2"/>
             <w:tcMar>
               <w:top w:w="40" w:type="dxa"/>
@@ -3466,13 +3676,28 @@
                 <w:sz w:val="18"/>
                 <w:szCs w:val="18"/>
               </w:rPr>
-              <w:t>탈취된 토큰이 재사용되면?</w:t>
-            </w:r>
-          </w:p>
-        </w:tc>
-        <w:tc>
-          <w:tcPr>
-            <w:tcW w:w="3600" w:type="dxa"/>
+              <w:t>탈취된 토큰이 재사용</w:t>
+            </w:r>
+            <w:r>
+              <w:rPr>
+                <w:rFonts w:hint="eastAsia"/>
+                <w:sz w:val="18"/>
+                <w:szCs w:val="18"/>
+              </w:rPr>
+              <w:t xml:space="preserve"> </w:t>
+            </w:r>
+            <w:r>
+              <w:rPr>
+                <w:sz w:val="18"/>
+                <w:szCs w:val="18"/>
+              </w:rPr>
+              <w:t>되면?</w:t>
+            </w:r>
+          </w:p>
+        </w:tc>
+        <w:tc>
+          <w:tcPr>
+            <w:tcW w:w="3144" w:type="dxa"/>
             <w:tcMar>
               <w:top w:w="40" w:type="dxa"/>
               <w:left w:w="80" w:type="dxa"/>
@@ -3492,7 +3717,7 @@
         </w:tc>
         <w:tc>
           <w:tcPr>
-            <w:tcW w:w="3600" w:type="dxa"/>
+            <w:tcW w:w="3309" w:type="dxa"/>
             <w:gridSpan w:val="2"/>
             <w:tcMar>
               <w:top w:w="40" w:type="dxa"/>
@@ -3524,7 +3749,7 @@
           <w:bCs/>
           <w:color w:val="2E5496"/>
         </w:rPr>
-        <w:t>4-4. 추가/변경 코드 (한눈에)</w:t>
+        <w:t xml:space="preserve">4-4. 추가/변경 코드 </w:t>
       </w:r>
     </w:p>
     <w:tbl>
@@ -3541,9 +3766,9 @@
         <w:tblLook w:val="04A0" w:firstRow="1" w:lastRow="0" w:firstColumn="1" w:lastColumn="0" w:noHBand="0" w:noVBand="1"/>
       </w:tblPr>
       <w:tblGrid>
-        <w:gridCol w:w="2659"/>
-        <w:gridCol w:w="1584"/>
-        <w:gridCol w:w="4757"/>
+        <w:gridCol w:w="2830"/>
+        <w:gridCol w:w="993"/>
+        <w:gridCol w:w="5177"/>
       </w:tblGrid>
       <w:tr>
         <w:trPr>
@@ -3551,7 +3776,7 @@
         </w:trPr>
         <w:tc>
           <w:tcPr>
-            <w:tcW w:w="2600" w:type="dxa"/>
+            <w:tcW w:w="2830" w:type="dxa"/>
             <w:shd w:val="clear" w:color="auto" w:fill="2E5496"/>
             <w:tcMar>
               <w:top w:w="40" w:type="dxa"/>
@@ -3575,7 +3800,7 @@
         </w:tc>
         <w:tc>
           <w:tcPr>
-            <w:tcW w:w="1600" w:type="dxa"/>
+            <w:tcW w:w="993" w:type="dxa"/>
             <w:shd w:val="clear" w:color="auto" w:fill="2E5496"/>
             <w:tcMar>
               <w:top w:w="40" w:type="dxa"/>
@@ -3599,7 +3824,7 @@
         </w:tc>
         <w:tc>
           <w:tcPr>
-            <w:tcW w:w="4800" w:type="dxa"/>
+            <w:tcW w:w="5177" w:type="dxa"/>
             <w:shd w:val="clear" w:color="auto" w:fill="2E5496"/>
             <w:tcMar>
               <w:top w:w="40" w:type="dxa"/>
@@ -3625,7 +3850,7 @@
       <w:tr>
         <w:tc>
           <w:tcPr>
-            <w:tcW w:w="2600" w:type="dxa"/>
+            <w:tcW w:w="2830" w:type="dxa"/>
             <w:tcMar>
               <w:top w:w="40" w:type="dxa"/>
               <w:left w:w="80" w:type="dxa"/>
@@ -3645,7 +3870,7 @@
         </w:tc>
         <w:tc>
           <w:tcPr>
-            <w:tcW w:w="1600" w:type="dxa"/>
+            <w:tcW w:w="993" w:type="dxa"/>
             <w:tcMar>
               <w:top w:w="40" w:type="dxa"/>
               <w:left w:w="80" w:type="dxa"/>
@@ -3665,7 +3890,7 @@
         </w:tc>
         <w:tc>
           <w:tcPr>
-            <w:tcW w:w="4800" w:type="dxa"/>
+            <w:tcW w:w="5177" w:type="dxa"/>
             <w:tcMar>
               <w:top w:w="40" w:type="dxa"/>
               <w:left w:w="80" w:type="dxa"/>
@@ -3687,7 +3912,7 @@
       <w:tr>
         <w:tc>
           <w:tcPr>
-            <w:tcW w:w="2600" w:type="dxa"/>
+            <w:tcW w:w="2830" w:type="dxa"/>
             <w:tcMar>
               <w:top w:w="40" w:type="dxa"/>
               <w:left w:w="80" w:type="dxa"/>
@@ -3707,7 +3932,7 @@
         </w:tc>
         <w:tc>
           <w:tcPr>
-            <w:tcW w:w="1600" w:type="dxa"/>
+            <w:tcW w:w="993" w:type="dxa"/>
             <w:tcMar>
               <w:top w:w="40" w:type="dxa"/>
               <w:left w:w="80" w:type="dxa"/>
@@ -3727,7 +3952,7 @@
         </w:tc>
         <w:tc>
           <w:tcPr>
-            <w:tcW w:w="4800" w:type="dxa"/>
+            <w:tcW w:w="5177" w:type="dxa"/>
             <w:tcMar>
               <w:top w:w="40" w:type="dxa"/>
               <w:left w:w="80" w:type="dxa"/>
@@ -3749,7 +3974,7 @@
       <w:tr>
         <w:tc>
           <w:tcPr>
-            <w:tcW w:w="2600" w:type="dxa"/>
+            <w:tcW w:w="2830" w:type="dxa"/>
             <w:tcMar>
               <w:top w:w="40" w:type="dxa"/>
               <w:left w:w="80" w:type="dxa"/>
@@ -3769,7 +3994,7 @@
         </w:tc>
         <w:tc>
           <w:tcPr>
-            <w:tcW w:w="1600" w:type="dxa"/>
+            <w:tcW w:w="993" w:type="dxa"/>
             <w:tcMar>
               <w:top w:w="40" w:type="dxa"/>
               <w:left w:w="80" w:type="dxa"/>
@@ -3789,7 +4014,7 @@
         </w:tc>
         <w:tc>
           <w:tcPr>
-            <w:tcW w:w="4800" w:type="dxa"/>
+            <w:tcW w:w="5177" w:type="dxa"/>
             <w:tcMar>
               <w:top w:w="40" w:type="dxa"/>
               <w:left w:w="80" w:type="dxa"/>
@@ -3811,7 +4036,7 @@
       <w:tr>
         <w:tc>
           <w:tcPr>
-            <w:tcW w:w="2600" w:type="dxa"/>
+            <w:tcW w:w="2830" w:type="dxa"/>
             <w:tcMar>
               <w:top w:w="40" w:type="dxa"/>
               <w:left w:w="80" w:type="dxa"/>
@@ -3831,7 +4056,7 @@
         </w:tc>
         <w:tc>
           <w:tcPr>
-            <w:tcW w:w="1600" w:type="dxa"/>
+            <w:tcW w:w="993" w:type="dxa"/>
             <w:tcMar>
               <w:top w:w="40" w:type="dxa"/>
               <w:left w:w="80" w:type="dxa"/>
@@ -3851,7 +4076,7 @@
         </w:tc>
         <w:tc>
           <w:tcPr>
-            <w:tcW w:w="4800" w:type="dxa"/>
+            <w:tcW w:w="5177" w:type="dxa"/>
             <w:tcMar>
               <w:top w:w="40" w:type="dxa"/>
               <w:left w:w="80" w:type="dxa"/>
@@ -3873,7 +4098,7 @@
       <w:tr>
         <w:tc>
           <w:tcPr>
-            <w:tcW w:w="2600" w:type="dxa"/>
+            <w:tcW w:w="2830" w:type="dxa"/>
             <w:tcMar>
               <w:top w:w="40" w:type="dxa"/>
               <w:left w:w="80" w:type="dxa"/>
@@ -3893,7 +4118,7 @@
         </w:tc>
         <w:tc>
           <w:tcPr>
-            <w:tcW w:w="1600" w:type="dxa"/>
+            <w:tcW w:w="993" w:type="dxa"/>
             <w:tcMar>
               <w:top w:w="40" w:type="dxa"/>
               <w:left w:w="80" w:type="dxa"/>
@@ -3913,7 +4138,7 @@
         </w:tc>
         <w:tc>
           <w:tcPr>
-            <w:tcW w:w="4800" w:type="dxa"/>
+            <w:tcW w:w="5177" w:type="dxa"/>
             <w:tcMar>
               <w:top w:w="40" w:type="dxa"/>
               <w:left w:w="80" w:type="dxa"/>
@@ -3935,7 +4160,7 @@
       <w:tr>
         <w:tc>
           <w:tcPr>
-            <w:tcW w:w="2600" w:type="dxa"/>
+            <w:tcW w:w="2830" w:type="dxa"/>
             <w:tcMar>
               <w:top w:w="40" w:type="dxa"/>
               <w:left w:w="80" w:type="dxa"/>
@@ -3955,7 +4180,7 @@
         </w:tc>
         <w:tc>
           <w:tcPr>
-            <w:tcW w:w="1600" w:type="dxa"/>
+            <w:tcW w:w="993" w:type="dxa"/>
             <w:tcMar>
               <w:top w:w="40" w:type="dxa"/>
               <w:left w:w="80" w:type="dxa"/>
@@ -3975,7 +4200,7 @@
         </w:tc>
         <w:tc>
           <w:tcPr>
-            <w:tcW w:w="4800" w:type="dxa"/>
+            <w:tcW w:w="5177" w:type="dxa"/>
             <w:tcMar>
               <w:top w:w="40" w:type="dxa"/>
               <w:left w:w="80" w:type="dxa"/>
@@ -3997,7 +4222,7 @@
       <w:tr>
         <w:tc>
           <w:tcPr>
-            <w:tcW w:w="2600" w:type="dxa"/>
+            <w:tcW w:w="2830" w:type="dxa"/>
             <w:tcMar>
               <w:top w:w="40" w:type="dxa"/>
               <w:left w:w="80" w:type="dxa"/>
@@ -4017,7 +4242,7 @@
         </w:tc>
         <w:tc>
           <w:tcPr>
-            <w:tcW w:w="1600" w:type="dxa"/>
+            <w:tcW w:w="993" w:type="dxa"/>
             <w:tcMar>
               <w:top w:w="40" w:type="dxa"/>
               <w:left w:w="80" w:type="dxa"/>
@@ -4037,7 +4262,7 @@
         </w:tc>
         <w:tc>
           <w:tcPr>
-            <w:tcW w:w="4800" w:type="dxa"/>
+            <w:tcW w:w="5177" w:type="dxa"/>
             <w:tcMar>
               <w:top w:w="40" w:type="dxa"/>
               <w:left w:w="80" w:type="dxa"/>
@@ -4057,6 +4282,15 @@
         </w:tc>
       </w:tr>
     </w:tbl>
+    <w:p>
+      <w:pPr>
+        <w:spacing w:after="80" w:line="272" w:lineRule="auto"/>
+        <w:rPr>
+          <w:b/>
+          <w:bCs/>
+        </w:rPr>
+      </w:pPr>
+    </w:p>
     <w:p>
       <w:pPr>
         <w:spacing w:after="80" w:line="272" w:lineRule="auto"/>
@@ -4083,8 +4317,8 @@
         <w:tblLook w:val="04A0" w:firstRow="1" w:lastRow="0" w:firstColumn="1" w:lastColumn="0" w:noHBand="0" w:noVBand="1"/>
       </w:tblPr>
       <w:tblGrid>
-        <w:gridCol w:w="4500"/>
-        <w:gridCol w:w="4500"/>
+        <w:gridCol w:w="3964"/>
+        <w:gridCol w:w="5036"/>
       </w:tblGrid>
       <w:tr>
         <w:trPr>
@@ -4092,7 +4326,7 @@
         </w:trPr>
         <w:tc>
           <w:tcPr>
-            <w:tcW w:w="4500" w:type="dxa"/>
+            <w:tcW w:w="3964" w:type="dxa"/>
             <w:shd w:val="clear" w:color="auto" w:fill="2E5496"/>
             <w:tcMar>
               <w:top w:w="40" w:type="dxa"/>
@@ -4116,7 +4350,7 @@
         </w:tc>
         <w:tc>
           <w:tcPr>
-            <w:tcW w:w="4500" w:type="dxa"/>
+            <w:tcW w:w="5036" w:type="dxa"/>
             <w:shd w:val="clear" w:color="auto" w:fill="2E5496"/>
             <w:tcMar>
               <w:top w:w="40" w:type="dxa"/>
@@ -4142,7 +4376,7 @@
       <w:tr>
         <w:tc>
           <w:tcPr>
-            <w:tcW w:w="4500" w:type="dxa"/>
+            <w:tcW w:w="3964" w:type="dxa"/>
             <w:tcMar>
               <w:top w:w="40" w:type="dxa"/>
               <w:left w:w="80" w:type="dxa"/>
@@ -4162,7 +4396,7 @@
         </w:tc>
         <w:tc>
           <w:tcPr>
-            <w:tcW w:w="4500" w:type="dxa"/>
+            <w:tcW w:w="5036" w:type="dxa"/>
             <w:tcMar>
               <w:top w:w="40" w:type="dxa"/>
               <w:left w:w="80" w:type="dxa"/>
@@ -4184,7 +4418,7 @@
       <w:tr>
         <w:tc>
           <w:tcPr>
-            <w:tcW w:w="4500" w:type="dxa"/>
+            <w:tcW w:w="3964" w:type="dxa"/>
             <w:tcMar>
               <w:top w:w="40" w:type="dxa"/>
               <w:left w:w="80" w:type="dxa"/>
@@ -4204,7 +4438,7 @@
         </w:tc>
         <w:tc>
           <w:tcPr>
-            <w:tcW w:w="4500" w:type="dxa"/>
+            <w:tcW w:w="5036" w:type="dxa"/>
             <w:tcMar>
               <w:top w:w="40" w:type="dxa"/>
               <w:left w:w="80" w:type="dxa"/>
@@ -4226,7 +4460,7 @@
       <w:tr>
         <w:tc>
           <w:tcPr>
-            <w:tcW w:w="4500" w:type="dxa"/>
+            <w:tcW w:w="3964" w:type="dxa"/>
             <w:tcMar>
               <w:top w:w="40" w:type="dxa"/>
               <w:left w:w="80" w:type="dxa"/>
@@ -4246,7 +4480,7 @@
         </w:tc>
         <w:tc>
           <w:tcPr>
-            <w:tcW w:w="4500" w:type="dxa"/>
+            <w:tcW w:w="5036" w:type="dxa"/>
             <w:tcMar>
               <w:top w:w="40" w:type="dxa"/>
               <w:left w:w="80" w:type="dxa"/>
@@ -4268,7 +4502,7 @@
       <w:tr>
         <w:tc>
           <w:tcPr>
-            <w:tcW w:w="4500" w:type="dxa"/>
+            <w:tcW w:w="3964" w:type="dxa"/>
             <w:tcMar>
               <w:top w:w="40" w:type="dxa"/>
               <w:left w:w="80" w:type="dxa"/>
@@ -4288,7 +4522,7 @@
         </w:tc>
         <w:tc>
           <w:tcPr>
-            <w:tcW w:w="4500" w:type="dxa"/>
+            <w:tcW w:w="5036" w:type="dxa"/>
             <w:tcMar>
               <w:top w:w="40" w:type="dxa"/>
               <w:left w:w="80" w:type="dxa"/>
@@ -4319,7 +4553,25 @@
           <w:bCs/>
           <w:color w:val="2E5496"/>
         </w:rPr>
-        <w:t>4-5. 보강 적용 — 토큰 해시 저장 + 재사용 탐지 (2026-10-13 적용됨)</w:t>
+        <w:lastRenderedPageBreak/>
+        <w:t xml:space="preserve">4-5. </w:t>
+      </w:r>
+      <w:r>
+        <w:rPr>
+          <w:rFonts w:hint="eastAsia"/>
+          <w:b/>
+          <w:bCs/>
+          <w:color w:val="2E5496"/>
+        </w:rPr>
+        <w:t xml:space="preserve">기능 추가</w:t>
+      </w:r>
+      <w:r>
+        <w:rPr>
+          <w:b/>
+          <w:bCs/>
+          <w:color w:val="2E5496"/>
+        </w:rPr>
+        <w:t xml:space="preserve"> 적용 — 토큰 해시 저장 + 재사용 탐지 </w:t>
       </w:r>
     </w:p>
     <w:p>
@@ -4327,8 +4579,34 @@
         <w:spacing w:after="80" w:line="272" w:lineRule="auto"/>
       </w:pPr>
       <w:r>
-        <w:rPr/>
-        <w:t xml:space="preserve">refresh 서버 저장은 JWT 의 stateless 장점을 일부 포기하는 트레이드오프다(DB 조회 증가). 대신 stateless 만으로는 불가능했던 무효화 능력을 얻는다. 4-3 에서 "폐기된 refresh 재사용 시 401 → 이상 신호로 탐지 가능"까지는 1차 구현에 있었지만, 탐지된 신호로 실제 무엇을 하는지와 DB 유출 시 원문 노출 문제는 비어 있었다 — 이번에 두 가지를 채웠다.</w:t>
+        <w:t>refresh 서버 저장은 JWT 의 stateless 장점을 일부 포기하는 트레이드</w:t>
+      </w:r>
+      <w:r>
+        <w:rPr>
+          <w:rFonts w:hint="eastAsia"/>
+        </w:rPr>
+        <w:t xml:space="preserve"> </w:t>
+      </w:r>
+      <w:r>
+        <w:t>오프</w:t>
+      </w:r>
+      <w:r>
+        <w:rPr>
+          <w:rFonts w:hint="eastAsia"/>
+        </w:rPr>
+        <w:t>이</w:t>
+      </w:r>
+      <w:r>
+        <w:t>다(DB 조회 증가). 대신 stateless 만으로는 불가능</w:t>
+      </w:r>
+      <w:r>
+        <w:rPr>
+          <w:rFonts w:hint="eastAsia"/>
+        </w:rPr>
+        <w:t xml:space="preserve"> </w:t>
+      </w:r>
+      <w:r>
+        <w:t>했던 무효화 능력을 얻는다. 4-3 에서 "폐기된 refresh 재사용 시 401 → 이상 신호로 탐지 가능"까지는 1차 구현에 있었지만, 탐지된 신호로 실제 무엇을 하는지와 DB 유출 시 원문 노출 문제는 비어 있었다 — 이번에 두 가지를 채웠다.</w:t>
       </w:r>
     </w:p>
     <w:p>
@@ -4340,7 +4618,7 @@
           <w:b/>
           <w:bCs/>
         </w:rPr>
-        <w:t xml:space="preserve">① 원문 대신 해시 저장</w:t>
+        <w:t>① 원문 대신 해시 저장</w:t>
       </w:r>
     </w:p>
     <w:p>
@@ -4348,8 +4626,7 @@
         <w:spacing w:after="80" w:line="272" w:lineRule="auto"/>
       </w:pPr>
       <w:r>
-        <w:rPr/>
-        <w:t xml:space="preserve">RefreshToken.tokenHash(SHA-256, hex 64자)만 DB 에 저장한다. 원문(plainToken)은 발급·회전 시 응답으로만 전달되고 서버에는 남지 않는다. DB 가 유출돼도 해시는 단방향 함수라 원문을 복원할 수 없으므로, 공격자가 그 값으로 /refresh 를 호출해 로그인을 유지할 수 없다.</w:t>
+        <w:t>RefreshToken.tokenHash(SHA-256, hex 64자)만 DB 에 저장한다. 원문(plainToken)은 발급·회전 시 응답으로만 전달되고 서버에는 남지 않는다. DB 가 유출돼도 해시는 단방향 함수라 원문을 복원할 수 없으므로, 공격자가 그 값으로 /refresh 를 호출해 로그인을 유지할 수 없다.</w:t>
       </w:r>
     </w:p>
     <w:p>
@@ -4366,7 +4643,7 @@
           <w:sz w:val="18"/>
           <w:szCs w:val="18"/>
         </w:rPr>
-        <w:t xml:space="preserve">// RefreshTokenService.sha256Hex</w:t>
+        <w:t>// RefreshTokenService.sha256Hex</w:t>
       </w:r>
     </w:p>
     <w:p>
@@ -4382,7 +4659,7 @@
           <w:sz w:val="18"/>
           <w:szCs w:val="18"/>
         </w:rPr>
-        <w:t xml:space="preserve">MessageDigest digest = MessageDigest.getInstance("SHA-256");</w:t>
+        <w:t>MessageDigest digest = MessageDigest.getInstance("SHA-256");</w:t>
       </w:r>
     </w:p>
     <w:p>
@@ -4398,7 +4675,7 @@
           <w:sz w:val="18"/>
           <w:szCs w:val="18"/>
         </w:rPr>
-        <w:t xml:space="preserve">byte[] hash = digest.digest(raw.getBytes(StandardCharsets.UTF_8));</w:t>
+        <w:t>byte[] hash = digest.digest(raw.getBytes(StandardCharsets.UTF_8));</w:t>
       </w:r>
     </w:p>
     <w:p>
@@ -4414,7 +4691,7 @@
           <w:sz w:val="18"/>
           <w:szCs w:val="18"/>
         </w:rPr>
-        <w:t xml:space="preserve">return HexFormat.of().formatHex(hash);</w:t>
+        <w:t>return HexFormat.of().formatHex(hash);</w:t>
       </w:r>
     </w:p>
     <w:p>
@@ -4426,7 +4703,7 @@
           <w:b/>
           <w:bCs/>
         </w:rPr>
-        <w:t xml:space="preserve">② 재사용(탈취) 탐지 → 전체 세션 일괄 폐기</w:t>
+        <w:t>② 재사용(탈취) 탐지 → 전체 세션 일괄 폐기</w:t>
       </w:r>
     </w:p>
     <w:p>
@@ -4434,8 +4711,22 @@
         <w:spacing w:after="80" w:line="272" w:lineRule="auto"/>
       </w:pPr>
       <w:r>
-        <w:rPr/>
-        <w:t xml:space="preserve">보강 전 rotate() 는 사용된 토큰을 즉시 delete() 했다. 보강 후에는 삭제 대신 revoked=true 로 표시해 남겨둔다. 이미 revoked=true 인 토큰이 다시 /refresh 에 들어오면 "정상 사용자가 회전된(이미 버려진) 토큰을 또 쓸 리 없다 → 누군가 훔쳐서 쓰고 있다"로 간주하고, 그 사용자의 모든 refresh 토큰을 일괄 삭제한다(공격자가 이미 발급받은 최신 토큰까지 포함 — 공격자·정상 사용자 모두 재로그인 필요).</w:t>
+        <w:rPr>
+          <w:rFonts w:hint="eastAsia"/>
+        </w:rPr>
+        <w:t>기능추가</w:t>
+      </w:r>
+      <w:r>
+        <w:t xml:space="preserve"> 전</w:t>
+      </w:r>
+      <w:r>
+        <w:rPr>
+          <w:rFonts w:hint="eastAsia"/>
+        </w:rPr>
+        <w:t>에는</w:t>
+      </w:r>
+      <w:r>
+        <w:t xml:space="preserve"> rotate() 는 사용된 토큰을 즉시 delete() 했다. 보강 후에는 삭제 대신 revoked=true 로 표시해 남겨둔다. 이미 revoked=true 인 토큰이 다시 /refresh 에 들어오면 "정상 사용자가 회전된(이미 버려진) 토큰을 또 쓸 리 없다 → 누군가 훔쳐서 쓰고 있다"로 간주하고, 그 사용자의 모든 refresh 토큰을 일괄 삭제한다(공격자가 이미 발급받은 최신 토큰까지 포함 — 공격자·정상 사용자 모두 재로그인 필요).</w:t>
       </w:r>
     </w:p>
     <w:p>
@@ -4452,7 +4743,7 @@
           <w:sz w:val="18"/>
           <w:szCs w:val="18"/>
         </w:rPr>
-        <w:t xml:space="preserve">// RefreshTokenService.rotate</w:t>
+        <w:t>// RefreshTokenService.rotate</w:t>
       </w:r>
     </w:p>
     <w:p>
@@ -4468,7 +4759,7 @@
           <w:sz w:val="18"/>
           <w:szCs w:val="18"/>
         </w:rPr>
-        <w:t xml:space="preserve">if (rt.isRevoked()) {</w:t>
+        <w:t>if (rt.isRevoked()) {</w:t>
       </w:r>
     </w:p>
     <w:p>
@@ -4532,7 +4823,7 @@
           <w:sz w:val="18"/>
           <w:szCs w:val="18"/>
         </w:rPr>
-        <w:t xml:space="preserve">}</w:t>
+        <w:t>}</w:t>
       </w:r>
     </w:p>
     <w:p>
@@ -4547,8 +4838,7 @@
         <w:t xml:space="preserve">구현 중 발견한 함정 — "폐기했는데 왜 다시 쓰이지?" </w:t>
       </w:r>
       <w:r>
-        <w:rPr/>
-        <w:t xml:space="preserve">처음에는 repository.deleteAllByUserUuid(...) 를 rotate() 안에서 바로 호출했다. 그런데 rotate() 자체가 @Transactional 이고 바로 다음 줄에서 BadCredentialsException 을 던진다 — Spring 은 @Transactional 메서드가 런타임 예외로 끝나면 기본적으로 트랜잭션을 롤백하므로, 방금 호출한 삭제까지 통째로 취소돼 버렸다(실제로 재현: 재사용 탐지 로그는 찍히는데 DB 를 보면 토큰이 그대로 살아 있고, 그 토큰으로 갱신도 계속 성공했다). 자기 자신을 호출(self-invocation)해도 Spring AOP 프록시를 거치지 않아 @Transactional 전파 설정이 무시되므로, 삭제 전용의 별도 빈 RefreshTokenReuseGuard(@Transactional(propagation = REQUIRES_NEW))를 만들어 그 빈을 통해 호출하도록 고쳤다 — 그래야 rotate() 의 롤백과 무관하게 삭제가 즉시 커밋된다.</w:t>
+        <w:t>처음에는 repository.deleteAllByUserUuid(...) 를 rotate() 안에서 바로 호출했다. 그런데 rotate() 자체가 @Transactional 이고 바로 다음 줄에서 BadCredentialsException 을 던진다 — Spring 은 @Transactional 메서드가 런타임 예외로 끝나면 기본적으로 트랜잭션을 롤백하므로, 방금 호출한 삭제까지 통째로 취소돼 버렸다(실제로 재현: 재사용 탐지 로그는 찍히는데 DB 를 보면 토큰이 그대로 살아 있고, 그 토큰으로 갱신도 계속 성공했다). 자기 자신을 호출(self-invocation)해도 Spring AOP 프록시를 거치지 않아 @Transactional 전파 설정이 무시되므로, 삭제 전용의 별도 빈 RefreshTokenReuseGuard(@Transactional(propagation = REQUIRES_NEW))를 만들어 그 빈을 통해 호출하도록 고쳤다 — 그래야 rotate() 의 롤백과 무관하게 삭제가 즉시 커밋된다.</w:t>
       </w:r>
     </w:p>
     <w:p/>
@@ -4594,7 +4884,7 @@
                 <w:sz w:val="18"/>
                 <w:szCs w:val="18"/>
               </w:rPr>
-              <w:t xml:space="preserve">시나리오</w:t>
+              <w:t>시나리오</w:t>
             </w:r>
           </w:p>
         </w:tc>
@@ -4618,7 +4908,7 @@
                 <w:sz w:val="18"/>
                 <w:szCs w:val="18"/>
               </w:rPr>
-              <w:t xml:space="preserve">보강 전</w:t>
+              <w:t>보강 전</w:t>
             </w:r>
           </w:p>
         </w:tc>
@@ -4642,7 +4932,7 @@
                 <w:sz w:val="18"/>
                 <w:szCs w:val="18"/>
               </w:rPr>
-              <w:t xml:space="preserve">보강 후</w:t>
+              <w:t>보강 후</w:t>
             </w:r>
           </w:p>
         </w:tc>
@@ -4664,7 +4954,7 @@
                 <w:sz w:val="18"/>
                 <w:szCs w:val="18"/>
               </w:rPr>
-              <w:t xml:space="preserve">DB 유출</w:t>
+              <w:t>DB 유출</w:t>
             </w:r>
           </w:p>
         </w:tc>
@@ -4684,7 +4974,7 @@
                 <w:sz w:val="18"/>
                 <w:szCs w:val="18"/>
               </w:rPr>
-              <w:t xml:space="preserve">refresh 원문이 그대로 노출 → 즉시 재사용 가능</w:t>
+              <w:t>refresh 원문이 그대로 노출 → 즉시 재사용 가능</w:t>
             </w:r>
           </w:p>
         </w:tc>
@@ -4704,7 +4994,7 @@
                 <w:sz w:val="18"/>
                 <w:szCs w:val="18"/>
               </w:rPr>
-              <w:t xml:space="preserve">해시만 노출 → 원문 복원 불가, 재사용 불가</w:t>
+              <w:t>해시만 노출 → 원문 복원 불가, 재사용 불가</w:t>
             </w:r>
           </w:p>
         </w:tc>
@@ -4726,7 +5016,8 @@
                 <w:sz w:val="18"/>
                 <w:szCs w:val="18"/>
               </w:rPr>
-              <w:t xml:space="preserve">탈취범이 먼저 /refresh 호출 후 정상 사용자가 (이미 회전된) 옛 토큰으로 갱신 시도</w:t>
+              <w:lastRenderedPageBreak/>
+              <w:t>탈취범이 먼저 /refresh 호출 후 정상 사용자가 (이미 회전된) 옛 토큰으로 갱신 시도</w:t>
             </w:r>
           </w:p>
         </w:tc>
@@ -4746,7 +5037,7 @@
                 <w:sz w:val="18"/>
                 <w:szCs w:val="18"/>
               </w:rPr>
-              <w:t xml:space="preserve">단순 401(혼란만 발생) — 공격자의 새 토큰은 계속 유효</w:t>
+              <w:t>단순 401(혼란만 발생) — 공격자의 새 토큰은 계속 유효</w:t>
             </w:r>
           </w:p>
         </w:tc>
@@ -4766,7 +5057,7 @@
                 <w:sz w:val="18"/>
                 <w:szCs w:val="18"/>
               </w:rPr>
-              <w:t xml:space="preserve">재사용 감지 → 공격자가 받은 새 토큰까지 포함해 해당 사용자 전체 세션 폐기</w:t>
+              <w:t>재사용 감지 → 공격자가 받은 새 토큰까지 포함해 해당 사용자 전체 세션 폐기</w:t>
             </w:r>
           </w:p>
         </w:tc>
@@ -4788,7 +5079,7 @@
                 <w:sz w:val="18"/>
                 <w:szCs w:val="18"/>
               </w:rPr>
-              <w:t xml:space="preserve">탐지 로그</w:t>
+              <w:t>탐지 로그</w:t>
             </w:r>
           </w:p>
         </w:tc>
@@ -4808,7 +5099,7 @@
                 <w:sz w:val="18"/>
                 <w:szCs w:val="18"/>
               </w:rPr>
-              <w:t xml:space="preserve">없음</w:t>
+              <w:t>없음</w:t>
             </w:r>
           </w:p>
         </w:tc>
@@ -4828,7 +5119,7 @@
                 <w:sz w:val="18"/>
                 <w:szCs w:val="18"/>
               </w:rPr>
-              <w:t xml:space="preserve">[AUDIT] refresh 토큰 재사용 감지 - userUuid=... (SecurityAuditListener 와 동일한 [AUDIT] 규칙)</w:t>
+              <w:t>[AUDIT] refresh 토큰 재사용 감지 - userUuid=... (SecurityAuditListener 와 동일한 [AUDIT] 규칙)</w:t>
             </w:r>
           </w:p>
         </w:tc>
@@ -4844,7 +5135,7 @@
           <w:b/>
           <w:bCs/>
         </w:rPr>
-        <w:t xml:space="preserve">검증 결과 (실제 서버 기동 후 curl 로 확인, 2026-10-13):</w:t>
+        <w:t>검증 결과 (실제 서버 기동 후 curl 로 확인):</w:t>
       </w:r>
     </w:p>
     <w:tbl>
@@ -4888,7 +5179,7 @@
                 <w:sz w:val="18"/>
                 <w:szCs w:val="18"/>
               </w:rPr>
-              <w:t xml:space="preserve">단계</w:t>
+              <w:t>단계</w:t>
             </w:r>
           </w:p>
         </w:tc>
@@ -4912,7 +5203,7 @@
                 <w:sz w:val="18"/>
                 <w:szCs w:val="18"/>
               </w:rPr>
-              <w:t xml:space="preserve">결과</w:t>
+              <w:t>결과</w:t>
             </w:r>
           </w:p>
         </w:tc>
@@ -4934,7 +5225,7 @@
                 <w:sz w:val="18"/>
                 <w:szCs w:val="18"/>
               </w:rPr>
-              <w:t xml:space="preserve">로그인 → /refresh(정상 토큰)</w:t>
+              <w:t>로그인 → /refresh(정상 토큰)</w:t>
             </w:r>
           </w:p>
         </w:tc>
@@ -4976,7 +5267,7 @@
                 <w:sz w:val="18"/>
                 <w:szCs w:val="18"/>
               </w:rPr>
-              <w:t xml:space="preserve">방금 회전으로 폐기된 토큰으로 /refresh 재시도</w:t>
+              <w:t>방금 회전으로 폐기된 토큰으로 /refresh 재시도</w:t>
             </w:r>
           </w:p>
         </w:tc>
@@ -5018,7 +5309,7 @@
                 <w:sz w:val="18"/>
                 <w:szCs w:val="18"/>
               </w:rPr>
-              <w:t xml:space="preserve">위 재사용 탐지로 함께 폐기됐어야 할 최신(아직 안 쓴) 토큰으로 /refresh</w:t>
+              <w:t>위 재사용 탐지로 함께 폐기됐어야 할 최신(아직 안 쓴) 토큰으로 /refresh</w:t>
             </w:r>
           </w:p>
         </w:tc>
@@ -5060,7 +5351,7 @@
                 <w:sz w:val="18"/>
                 <w:szCs w:val="18"/>
               </w:rPr>
-              <w:t xml:space="preserve">DB 조회(SELECT token_hash FROM refresh_token)</w:t>
+              <w:t>DB 조회(SELECT token_hash FROM refresh_token)</w:t>
             </w:r>
           </w:p>
         </w:tc>
@@ -5102,7 +5393,7 @@
                 <w:sz w:val="18"/>
                 <w:szCs w:val="18"/>
               </w:rPr>
-              <w:t xml:space="preserve">로그아웃 후 그 refresh 로 /refresh</w:t>
+              <w:t>로그아웃 후 그 refresh 로 /refresh</w:t>
             </w:r>
           </w:p>
         </w:tc>
@@ -5138,7 +5429,7 @@
           <w:b/>
           <w:bCs/>
         </w:rPr>
-        <w:t xml:space="preserve">변경된 파일</w:t>
+        <w:t>변경된 파일</w:t>
       </w:r>
     </w:p>
     <w:tbl>
@@ -5182,7 +5473,7 @@
                 <w:sz w:val="18"/>
                 <w:szCs w:val="18"/>
               </w:rPr>
-              <w:t xml:space="preserve">파일</w:t>
+              <w:t>파일</w:t>
             </w:r>
           </w:p>
         </w:tc>
@@ -5206,7 +5497,7 @@
                 <w:sz w:val="18"/>
                 <w:szCs w:val="18"/>
               </w:rPr>
-              <w:t xml:space="preserve">한 일</w:t>
+              <w:t>한 일</w:t>
             </w:r>
           </w:p>
         </w:tc>
@@ -5228,7 +5519,7 @@
                 <w:sz w:val="18"/>
                 <w:szCs w:val="18"/>
               </w:rPr>
-              <w:t xml:space="preserve">RefreshToken</w:t>
+              <w:t>RefreshToken</w:t>
             </w:r>
           </w:p>
         </w:tc>
@@ -5248,7 +5539,7 @@
                 <w:sz w:val="18"/>
                 <w:szCs w:val="18"/>
               </w:rPr>
-              <w:t xml:space="preserve">token → tokenHash(해시만 저장), revoked(boolean) 필드 추가</w:t>
+              <w:t>token → tokenHash(해시만 저장), revoked(boolean) 필드 추가</w:t>
             </w:r>
           </w:p>
         </w:tc>
@@ -5270,7 +5561,7 @@
                 <w:sz w:val="18"/>
                 <w:szCs w:val="18"/>
               </w:rPr>
-              <w:t xml:space="preserve">RefreshTokenRepository</w:t>
+              <w:t>RefreshTokenRepository</w:t>
             </w:r>
           </w:p>
         </w:tc>
@@ -5290,7 +5581,7 @@
                 <w:sz w:val="18"/>
                 <w:szCs w:val="18"/>
               </w:rPr>
-              <w:t xml:space="preserve">findByToken → findByTokenHash, 재사용 탐지용 deleteAllByUserUuid 추가</w:t>
+              <w:t>findByToken → findByTokenHash, 재사용 탐지용 deleteAllByUserUuid 추가</w:t>
             </w:r>
           </w:p>
         </w:tc>
@@ -5312,7 +5603,7 @@
                 <w:sz w:val="18"/>
                 <w:szCs w:val="18"/>
               </w:rPr>
-              <w:t xml:space="preserve">RefreshTokenService</w:t>
+              <w:t>RefreshTokenService</w:t>
             </w:r>
           </w:p>
         </w:tc>
@@ -5332,7 +5623,7 @@
                 <w:sz w:val="18"/>
                 <w:szCs w:val="18"/>
               </w:rPr>
-              <w:t xml:space="preserve">issue/rotate 가 IssuedToken(원문·userUuid·만료시각) 반환. rotate 에 재사용 탐지 분기 추가</w:t>
+              <w:t>issue/rotate 가 IssuedToken(원문·userUuid·만료시각) 반환. rotate 에 재사용 탐지 분기 추가</w:t>
             </w:r>
           </w:p>
         </w:tc>
@@ -5354,7 +5645,7 @@
                 <w:sz w:val="18"/>
                 <w:szCs w:val="18"/>
               </w:rPr>
-              <w:t xml:space="preserve">RefreshTokenReuseGuard</w:t>
+              <w:t>RefreshTokenReuseGuard</w:t>
             </w:r>
           </w:p>
         </w:tc>
@@ -5374,7 +5665,7 @@
                 <w:sz w:val="18"/>
                 <w:szCs w:val="18"/>
               </w:rPr>
-              <w:t xml:space="preserve">신규 추가 — 재사용 탐지 시 전체 폐기를 REQUIRES_NEW 트랜잭션으로 커밋(위 함정 참고)</w:t>
+              <w:t>신규 추가 — 재사용 탐지 시 전체 폐기를 REQUIRES_NEW 트랜잭션으로 커밋(위 함정 참고)</w:t>
             </w:r>
           </w:p>
         </w:tc>
@@ -5396,7 +5687,7 @@
                 <w:sz w:val="18"/>
                 <w:szCs w:val="18"/>
               </w:rPr>
-              <w:t xml:space="preserve">UserInfoController</w:t>
+              <w:t>UserInfoController</w:t>
             </w:r>
           </w:p>
         </w:tc>
@@ -5416,7 +5707,7 @@
                 <w:sz w:val="18"/>
                 <w:szCs w:val="18"/>
               </w:rPr>
-              <w:t xml:space="preserve">RefreshToken 엔티티 대신 IssuedToken 에서 원문 토큰을 꺼내 응답</w:t>
+              <w:t>RefreshToken 엔티티 대신 IssuedToken 에서 원문 토큰을 꺼내 응답</w:t>
             </w:r>
           </w:p>
         </w:tc>
@@ -5432,7 +5723,7 @@
           <w:b/>
           <w:bCs/>
         </w:rPr>
-        <w:t xml:space="preserve">남아있는 보강 포인트 (이번 범위 밖)</w:t>
+        <w:t>남아있는 보강 포인트 (이번 범위 밖)</w:t>
       </w:r>
     </w:p>
     <w:p>
@@ -5472,6 +5763,7 @@
           <w:bCs/>
           <w:color w:val="2E5496"/>
         </w:rPr>
+        <w:lastRenderedPageBreak/>
         <w:t>4-6. API 요청 한눈에 보기</w:t>
       </w:r>
     </w:p>
@@ -5481,6 +5773,24 @@
       </w:pPr>
       <w:r>
         <w:t>Refresh 토큰 적용 후 실제 인증 흐름에서 호출하는 API 요청을 정리하면 다음과 같다. (Base URL: http://localhost:8080)</w:t>
+      </w:r>
+    </w:p>
+    <w:p>
+      <w:pPr>
+        <w:pBdr>
+          <w:top w:val="single" w:sz="4" w:space="3" w:color="D9D9D9"/>
+          <w:left w:val="single" w:sz="18" w:space="6" w:color="C0C0C0"/>
+          <w:bottom w:val="single" w:sz="4" w:space="3" w:color="D9D9D9"/>
+        </w:pBdr>
+        <w:shd w:val="clear" w:color="auto" w:fill="F4F4F4"/>
+      </w:pPr>
+      <w:r>
+        <w:rPr>
+          <w:rFonts w:ascii="Consolas" w:hAnsi="Consolas"/>
+          <w:sz w:val="18"/>
+          <w:szCs w:val="18"/>
+        </w:rPr>
+        <w:t>B=http://localhost:8080</w:t>
       </w:r>
     </w:p>
     <w:p>
@@ -5696,21 +6006,12 @@
         </w:rPr>
         <w:t xml:space="preserve">요청 후에 </w:t>
       </w:r>
-      <w:proofErr w:type="spellStart"/>
       <w:r>
         <w:rPr>
           <w:b/>
           <w:bCs/>
         </w:rPr>
-        <w:t>refresh_token</w:t>
-      </w:r>
-      <w:proofErr w:type="spellEnd"/>
-      <w:r>
-        <w:rPr>
-          <w:b/>
-          <w:bCs/>
-        </w:rPr>
-        <w:t xml:space="preserve"> </w:t>
+        <w:t xml:space="preserve">refresh_token </w:t>
       </w:r>
       <w:r>
         <w:rPr>
@@ -5731,93 +6032,109 @@
     <w:p>
       <w:pPr>
         <w:rPr>
+          <w:bCs/>
+        </w:rPr>
+      </w:pPr>
+      <w:r>
+        <w:rPr>
+          <w:bCs/>
+        </w:rPr>
+        <w:t xml:space="preserve">- </w:t>
+      </w:r>
+      <w:r>
+        <w:rPr>
           <w:rFonts w:hint="eastAsia"/>
           <w:bCs/>
         </w:rPr>
-      </w:pPr>
-      <w:r>
-        <w:rPr>
-          <w:bCs/>
-        </w:rPr>
-        <w:t xml:space="preserve">- </w:t>
-      </w:r>
-      <w:proofErr w:type="spellStart"/>
+        <w:t>u</w:t>
+      </w:r>
+      <w:r>
+        <w:rPr>
+          <w:bCs/>
+        </w:rPr>
+        <w:t xml:space="preserve">ser_info </w:t>
+      </w:r>
       <w:r>
         <w:rPr>
           <w:rFonts w:hint="eastAsia"/>
           <w:bCs/>
         </w:rPr>
-        <w:t>u</w:t>
-      </w:r>
-      <w:r>
-        <w:rPr>
-          <w:bCs/>
-        </w:rPr>
-        <w:t>ser_info</w:t>
-      </w:r>
-      <w:proofErr w:type="spellEnd"/>
-      <w:r>
-        <w:rPr>
-          <w:bCs/>
-        </w:rPr>
-        <w:t xml:space="preserve"> </w:t>
+        <w:t xml:space="preserve">테이블의 </w:t>
+      </w:r>
+      <w:r>
+        <w:rPr>
+          <w:bCs/>
+        </w:rPr>
+        <w:t xml:space="preserve">uuid </w:t>
       </w:r>
       <w:r>
         <w:rPr>
           <w:rFonts w:hint="eastAsia"/>
           <w:bCs/>
         </w:rPr>
-        <w:t xml:space="preserve">테이블의 </w:t>
-      </w:r>
-      <w:proofErr w:type="spellStart"/>
-      <w:r>
-        <w:rPr>
-          <w:bCs/>
-        </w:rPr>
-        <w:t>uuid</w:t>
-      </w:r>
-      <w:proofErr w:type="spellEnd"/>
-      <w:r>
-        <w:rPr>
-          <w:bCs/>
-        </w:rPr>
-        <w:t xml:space="preserve"> </w:t>
+        <w:t xml:space="preserve">와 매핑 되는 </w:t>
+      </w:r>
+      <w:r>
+        <w:rPr>
+          <w:bCs/>
+        </w:rPr>
+        <w:t>refresh_token</w:t>
       </w:r>
       <w:r>
         <w:rPr>
           <w:rFonts w:hint="eastAsia"/>
           <w:bCs/>
         </w:rPr>
-        <w:t xml:space="preserve">와 </w:t>
-      </w:r>
-      <w:proofErr w:type="spellStart"/>
-      <w:r>
+        <w:t xml:space="preserve">에 있는 u</w:t>
+      </w:r>
+      <w:r>
+        <w:rPr>
+          <w:bCs/>
+        </w:rPr>
+        <w:t xml:space="preserve">ser_uuid </w:t>
+      </w:r>
+    </w:p>
+    <w:p>
+      <w:pPr>
         <w:rPr>
           <w:rFonts w:hint="eastAsia"/>
           <w:bCs/>
         </w:rPr>
-        <w:t>매핑되는</w:t>
-      </w:r>
-      <w:proofErr w:type="spellEnd"/>
+      </w:pPr>
+      <w:r>
+        <w:rPr>
+          <w:bCs/>
+        </w:rPr>
+        <w:t xml:space="preserve">- token </w:t>
+      </w:r>
       <w:r>
         <w:rPr>
           <w:rFonts w:hint="eastAsia"/>
           <w:bCs/>
         </w:rPr>
-        <w:t xml:space="preserve"> </w:t>
-      </w:r>
-      <w:r>
-        <w:rPr>
-          <w:bCs/>
-        </w:rPr>
-        <w:t>refresh token</w:t>
+        <w:t xml:space="preserve">값을 </w:t>
+      </w:r>
+      <w:r>
+        <w:rPr>
+          <w:bCs/>
+        </w:rPr>
+        <w:t xml:space="preserve">hash </w:t>
       </w:r>
       <w:r>
         <w:rPr>
           <w:rFonts w:hint="eastAsia"/>
           <w:bCs/>
         </w:rPr>
-        <w:t>을 생성함</w:t>
+        <w:t xml:space="preserve">값으로 변환하여 </w:t>
+      </w:r>
+      <w:bookmarkStart w:id="0" w:name="_GoBack"/>
+      <w:bookmarkEnd w:id="0"/>
+      <w:r>
+        <w:rPr>
+          <w:rFonts w:hint="eastAsia"/>
+          <w:bCs/>
+        </w:rPr>
+        <w:t>저장합니다.</w:t>
       </w:r>
     </w:p>
     <w:p>
@@ -5832,10 +6149,10 @@
           <w:noProof/>
         </w:rPr>
         <w:drawing>
-          <wp:inline distT="0" distB="0" distL="0" distR="0" wp14:anchorId="6558EA9D" wp14:editId="075F4B40">
-            <wp:extent cx="6036310" cy="1296670"/>
-            <wp:effectExtent l="0" t="0" r="2540" b="0"/>
-            <wp:docPr id="10" name="그림 10"/>
+          <wp:inline distT="0" distB="0" distL="0" distR="0" wp14:anchorId="49656958" wp14:editId="6E75D727">
+            <wp:extent cx="6369685" cy="1438275"/>
+            <wp:effectExtent l="0" t="0" r="0" b="9525"/>
+            <wp:docPr id="3" name="그림 3"/>
             <wp:cNvGraphicFramePr>
               <a:graphicFrameLocks xmlns:a="http://schemas.openxmlformats.org/drawingml/2006/main" noChangeAspect="1"/>
             </wp:cNvGraphicFramePr>
@@ -5855,7 +6172,7 @@
                   <pic:spPr>
                     <a:xfrm>
                       <a:off x="0" y="0"/>
-                      <a:ext cx="6036310" cy="1296670"/>
+                      <a:ext cx="6370199" cy="1438391"/>
                     </a:xfrm>
                     <a:prstGeom prst="rect">
                       <a:avLst/>
@@ -5970,6 +6287,408 @@
         <w:spacing w:after="80" w:line="272" w:lineRule="auto"/>
       </w:pPr>
       <w:r>
+        <w:t>access 는 900초(15분) 후 만료된다. 만료된 토큰으로 보호된 API를 호출하면 거부되고, 이때 refresh 토큰으로 갱신하면 다시 정상 호출할 수 있다.</w:t>
+      </w:r>
+    </w:p>
+    <w:p>
+      <w:pPr>
+        <w:pBdr>
+          <w:top w:val="single" w:sz="4" w:space="3" w:color="D9D9D9"/>
+          <w:left w:val="single" w:sz="18" w:space="6" w:color="C0C0C0"/>
+          <w:bottom w:val="single" w:sz="4" w:space="3" w:color="D9D9D9"/>
+        </w:pBdr>
+        <w:shd w:val="clear" w:color="auto" w:fill="F4F4F4"/>
+        <w:rPr>
+          <w:rFonts w:ascii="Consolas" w:hAnsi="Consolas"/>
+          <w:sz w:val="18"/>
+          <w:szCs w:val="18"/>
+        </w:rPr>
+      </w:pPr>
+      <w:r>
+        <w:rPr>
+          <w:rFonts w:ascii="Consolas" w:hAnsi="Consolas"/>
+          <w:sz w:val="18"/>
+          <w:szCs w:val="18"/>
+        </w:rPr>
+        <w:t>B=http://localhost:8080</w:t>
+      </w:r>
+    </w:p>
+    <w:p>
+      <w:pPr>
+        <w:pBdr>
+          <w:top w:val="single" w:sz="4" w:space="3" w:color="D9D9D9"/>
+          <w:left w:val="single" w:sz="18" w:space="6" w:color="C0C0C0"/>
+          <w:bottom w:val="single" w:sz="4" w:space="3" w:color="D9D9D9"/>
+        </w:pBdr>
+        <w:shd w:val="clear" w:color="auto" w:fill="F4F4F4"/>
+        <w:rPr>
+          <w:rFonts w:ascii="Consolas" w:hAnsi="Consolas"/>
+          <w:sz w:val="18"/>
+          <w:szCs w:val="18"/>
+        </w:rPr>
+      </w:pPr>
+    </w:p>
+    <w:p>
+      <w:pPr>
+        <w:pBdr>
+          <w:top w:val="single" w:sz="4" w:space="3" w:color="D9D9D9"/>
+          <w:left w:val="single" w:sz="18" w:space="6" w:color="C0C0C0"/>
+          <w:bottom w:val="single" w:sz="4" w:space="3" w:color="D9D9D9"/>
+        </w:pBdr>
+        <w:shd w:val="clear" w:color="auto" w:fill="F4F4F4"/>
+        <w:rPr>
+          <w:rFonts w:ascii="Consolas" w:hAnsi="Consolas"/>
+          <w:sz w:val="18"/>
+          <w:szCs w:val="18"/>
+        </w:rPr>
+      </w:pPr>
+      <w:r>
+        <w:rPr>
+          <w:rFonts w:ascii="Consolas" w:hAnsi="Consolas"/>
+          <w:sz w:val="18"/>
+          <w:szCs w:val="18"/>
+        </w:rPr>
+        <w:t>LOGIN=$(curl -s "$B/api/userinfos/login" -H "Content-Type: application/json" -d '{"email":"admin@aa.com","password":"pwd1"}')</w:t>
+      </w:r>
+    </w:p>
+    <w:p>
+      <w:pPr>
+        <w:pBdr>
+          <w:top w:val="single" w:sz="4" w:space="3" w:color="D9D9D9"/>
+          <w:left w:val="single" w:sz="18" w:space="6" w:color="C0C0C0"/>
+          <w:bottom w:val="single" w:sz="4" w:space="3" w:color="D9D9D9"/>
+        </w:pBdr>
+        <w:shd w:val="clear" w:color="auto" w:fill="F4F4F4"/>
+      </w:pPr>
+    </w:p>
+    <w:p>
+      <w:pPr>
+        <w:pBdr>
+          <w:top w:val="single" w:sz="4" w:space="3" w:color="D9D9D9"/>
+          <w:left w:val="single" w:sz="18" w:space="6" w:color="C0C0C0"/>
+          <w:bottom w:val="single" w:sz="4" w:space="3" w:color="D9D9D9"/>
+        </w:pBdr>
+        <w:shd w:val="clear" w:color="auto" w:fill="F4F4F4"/>
+      </w:pPr>
+      <w:r>
+        <w:rPr>
+          <w:rFonts w:ascii="Consolas" w:hAnsi="Consolas"/>
+          <w:sz w:val="18"/>
+          <w:szCs w:val="18"/>
+        </w:rPr>
+        <w:t xml:space="preserve">UUID=$(echo "$LOGIN" | python -c "import sys,json;print(json.load(sys.stdin)['accessToken'])" | cut -d. -f2 | python -c "import sys,base64,json;s=sys.stdin.read().strip();s+='='*(-len(s)%4);print(json.loads(base64.urlsafe_b64decode(s))['sub'])")</w:t>
+      </w:r>
+    </w:p>
+    <w:p>
+      <w:pPr>
+        <w:pBdr>
+          <w:top w:val="single" w:sz="4" w:space="3" w:color="D9D9D9"/>
+          <w:left w:val="single" w:sz="18" w:space="6" w:color="C0C0C0"/>
+          <w:bottom w:val="single" w:sz="4" w:space="3" w:color="D9D9D9"/>
+        </w:pBdr>
+        <w:shd w:val="clear" w:color="auto" w:fill="F4F4F4"/>
+        <w:rPr>
+          <w:rFonts w:ascii="Consolas" w:hAnsi="Consolas"/>
+          <w:sz w:val="18"/>
+          <w:szCs w:val="18"/>
+        </w:rPr>
+      </w:pPr>
+    </w:p>
+    <w:p>
+      <w:pPr>
+        <w:pBdr>
+          <w:top w:val="single" w:sz="4" w:space="3" w:color="D9D9D9"/>
+          <w:left w:val="single" w:sz="18" w:space="6" w:color="C0C0C0"/>
+          <w:bottom w:val="single" w:sz="4" w:space="3" w:color="D9D9D9"/>
+        </w:pBdr>
+        <w:shd w:val="clear" w:color="auto" w:fill="F4F4F4"/>
+        <w:rPr>
+          <w:rFonts w:ascii="Consolas" w:hAnsi="Consolas"/>
+          <w:sz w:val="18"/>
+          <w:szCs w:val="18"/>
+        </w:rPr>
+      </w:pPr>
+      <w:r>
+        <w:rPr>
+          <w:rFonts w:ascii="Consolas" w:hAnsi="Consolas"/>
+          <w:sz w:val="18"/>
+          <w:szCs w:val="18"/>
+        </w:rPr>
+        <w:t xml:space="preserve">REFRESH=$(echo "$LOGIN" | python -c "import sys,json;print(json.load(sys.stdin)['refreshToken'])")</w:t>
+      </w:r>
+    </w:p>
+    <w:p>
+      <w:pPr>
+        <w:pBdr>
+          <w:top w:val="single" w:sz="4" w:space="3" w:color="D9D9D9"/>
+          <w:left w:val="single" w:sz="18" w:space="6" w:color="C0C0C0"/>
+          <w:bottom w:val="single" w:sz="4" w:space="3" w:color="D9D9D9"/>
+        </w:pBdr>
+        <w:shd w:val="clear" w:color="auto" w:fill="F4F4F4"/>
+      </w:pPr>
+    </w:p>
+    <w:p>
+      <w:pPr>
+        <w:pBdr>
+          <w:top w:val="single" w:sz="4" w:space="3" w:color="D9D9D9"/>
+          <w:left w:val="single" w:sz="18" w:space="6" w:color="C0C0C0"/>
+          <w:bottom w:val="single" w:sz="4" w:space="3" w:color="D9D9D9"/>
+        </w:pBdr>
+        <w:shd w:val="clear" w:color="auto" w:fill="F4F4F4"/>
+      </w:pPr>
+      <w:r>
+        <w:rPr>
+          <w:rFonts w:ascii="Consolas" w:hAnsi="Consolas"/>
+          <w:sz w:val="18"/>
+          <w:szCs w:val="18"/>
+        </w:rPr>
+        <w:t xml:space="preserve"># 만료된 access 토큰은 jwt_forge.py 의 forge() 를 ttl(음수)로 직접 호출해 재현했다</w:t>
+      </w:r>
+    </w:p>
+    <w:p>
+      <w:pPr>
+        <w:pBdr>
+          <w:top w:val="single" w:sz="4" w:space="3" w:color="D9D9D9"/>
+          <w:left w:val="single" w:sz="18" w:space="6" w:color="C0C0C0"/>
+          <w:bottom w:val="single" w:sz="4" w:space="3" w:color="D9D9D9"/>
+        </w:pBdr>
+        <w:shd w:val="clear" w:color="auto" w:fill="F4F4F4"/>
+        <w:rPr>
+          <w:rFonts w:ascii="Consolas" w:hAnsi="Consolas"/>
+          <w:sz w:val="18"/>
+          <w:szCs w:val="18"/>
+        </w:rPr>
+      </w:pPr>
+      <w:r>
+        <w:rPr>
+          <w:rFonts w:ascii="Consolas" w:hAnsi="Consolas"/>
+          <w:sz w:val="18"/>
+          <w:szCs w:val="18"/>
+        </w:rPr>
+        <w:t xml:space="preserve">EXPIRED_ACCESS=$(python -c "import sys; sys.path.insert(0, 'docs/security'); import jwt_forge; print(jwt_forge.forge('$UUID', ttl=-30))")</w:t>
+      </w:r>
+    </w:p>
+    <w:p>
+      <w:pPr>
+        <w:pBdr>
+          <w:top w:val="single" w:sz="4" w:space="3" w:color="D9D9D9"/>
+          <w:left w:val="single" w:sz="18" w:space="6" w:color="C0C0C0"/>
+          <w:bottom w:val="single" w:sz="4" w:space="3" w:color="D9D9D9"/>
+        </w:pBdr>
+        <w:shd w:val="clear" w:color="auto" w:fill="F4F4F4"/>
+      </w:pPr>
+    </w:p>
+    <w:p>
+      <w:pPr>
+        <w:pBdr>
+          <w:top w:val="single" w:sz="4" w:space="3" w:color="D9D9D9"/>
+          <w:left w:val="single" w:sz="18" w:space="6" w:color="C0C0C0"/>
+          <w:bottom w:val="single" w:sz="4" w:space="3" w:color="D9D9D9"/>
+        </w:pBdr>
+        <w:shd w:val="clear" w:color="auto" w:fill="F4F4F4"/>
+        <w:rPr>
+          <w:rFonts w:ascii="Consolas" w:hAnsi="Consolas"/>
+          <w:sz w:val="18"/>
+          <w:szCs w:val="18"/>
+        </w:rPr>
+      </w:pPr>
+      <w:r>
+        <w:rPr>
+          <w:rFonts w:ascii="Consolas" w:hAnsi="Consolas"/>
+          <w:sz w:val="18"/>
+          <w:szCs w:val="18"/>
+        </w:rPr>
+        <w:t>curl -s -w "\n%{http_code}\n" "$B/api/userinfos/me" -H "Authorization: Bearer $EXPIRED_ACCESS"</w:t>
+      </w:r>
+    </w:p>
+    <w:p>
+      <w:pPr>
+        <w:pBdr>
+          <w:top w:val="single" w:sz="4" w:space="3" w:color="D9D9D9"/>
+          <w:left w:val="single" w:sz="18" w:space="6" w:color="C0C0C0"/>
+          <w:bottom w:val="single" w:sz="4" w:space="3" w:color="D9D9D9"/>
+        </w:pBdr>
+        <w:shd w:val="clear" w:color="auto" w:fill="F4F4F4"/>
+      </w:pPr>
+    </w:p>
+    <w:p>
+      <w:pPr>
+        <w:pBdr>
+          <w:top w:val="single" w:sz="4" w:space="3" w:color="D9D9D9"/>
+          <w:left w:val="single" w:sz="18" w:space="6" w:color="C0C0C0"/>
+          <w:bottom w:val="single" w:sz="4" w:space="3" w:color="D9D9D9"/>
+        </w:pBdr>
+        <w:shd w:val="clear" w:color="auto" w:fill="F4F4F4"/>
+      </w:pPr>
+      <w:r>
+        <w:rPr>
+          <w:rFonts w:ascii="Consolas" w:hAnsi="Consolas"/>
+          <w:sz w:val="18"/>
+          <w:szCs w:val="18"/>
+        </w:rPr>
+        <w:t>curl -s -w "\n%{http_code}\n" "$B/api/userinfos/refresh" -H "Content-Type: application/json" -d "{\"refreshToken\":\"$REFRESH\"}"</w:t>
+      </w:r>
+    </w:p>
+    <w:tbl>
+      <w:tblPr>
+        <w:tblW w:w="9000" w:type="dxa"/>
+        <w:tblBorders>
+          <w:top w:val="single" w:sz="4" w:space="0" w:color="BFBFBF"/>
+          <w:left w:val="single" w:sz="4" w:space="0" w:color="BFBFBF"/>
+          <w:bottom w:val="single" w:sz="4" w:space="0" w:color="BFBFBF"/>
+          <w:right w:val="single" w:sz="4" w:space="0" w:color="BFBFBF"/>
+          <w:insideH w:val="single" w:sz="4" w:space="0" w:color="BFBFBF"/>
+          <w:insideV w:val="single" w:sz="4" w:space="0" w:color="BFBFBF"/>
+        </w:tblBorders>
+        <w:tblLook w:val="04A0" w:firstRow="1" w:lastRow="0" w:firstColumn="1" w:lastColumn="0" w:noHBand="0" w:noVBand="1"/>
+      </w:tblPr>
+      <w:tblGrid>
+        <w:gridCol w:w="3964"/>
+        <w:gridCol w:w="5036"/>
+      </w:tblGrid>
+      <w:tr>
+        <w:trPr>
+          <w:tblHeader/>
+        </w:trPr>
+        <w:tc>
+          <w:tcPr>
+            <w:tcW w:w="3964" w:type="dxa"/>
+            <w:shd w:val="clear" w:color="auto" w:fill="2E5496"/>
+            <w:tcMar>
+              <w:top w:w="40" w:type="dxa"/>
+              <w:left w:w="80" w:type="dxa"/>
+              <w:bottom w:w="40" w:type="dxa"/>
+              <w:right w:w="80" w:type="dxa"/>
+            </w:tcMar>
+          </w:tcPr>
+          <w:p>
+            <w:r>
+              <w:rPr>
+                <w:b/>
+                <w:bCs/>
+                <w:color w:val="FFFFFF"/>
+                <w:sz w:val="18"/>
+                <w:szCs w:val="18"/>
+              </w:rPr>
+              <w:t>요청</w:t>
+            </w:r>
+          </w:p>
+        </w:tc>
+        <w:tc>
+          <w:tcPr>
+            <w:tcW w:w="5036" w:type="dxa"/>
+            <w:shd w:val="clear" w:color="auto" w:fill="2E5496"/>
+            <w:tcMar>
+              <w:top w:w="40" w:type="dxa"/>
+              <w:left w:w="80" w:type="dxa"/>
+              <w:bottom w:w="40" w:type="dxa"/>
+              <w:right w:w="80" w:type="dxa"/>
+            </w:tcMar>
+          </w:tcPr>
+          <w:p>
+            <w:r>
+              <w:rPr>
+                <w:b/>
+                <w:bCs/>
+                <w:color w:val="FFFFFF"/>
+                <w:sz w:val="18"/>
+                <w:szCs w:val="18"/>
+              </w:rPr>
+              <w:t>결과</w:t>
+            </w:r>
+          </w:p>
+        </w:tc>
+      </w:tr>
+      <w:tr>
+        <w:tc>
+          <w:tcPr>
+            <w:tcW w:w="3964" w:type="dxa"/>
+            <w:tcMar>
+              <w:top w:w="40" w:type="dxa"/>
+              <w:left w:w="80" w:type="dxa"/>
+              <w:bottom w:w="40" w:type="dxa"/>
+              <w:right w:w="80" w:type="dxa"/>
+            </w:tcMar>
+          </w:tcPr>
+          <w:p>
+            <w:r>
+              <w:rPr>
+                <w:sz w:val="18"/>
+                <w:szCs w:val="18"/>
+              </w:rPr>
+              <w:t>만료된 access 토큰으로 /me</w:t>
+            </w:r>
+          </w:p>
+        </w:tc>
+        <w:tc>
+          <w:tcPr>
+            <w:tcW w:w="5036" w:type="dxa"/>
+            <w:tcMar>
+              <w:top w:w="40" w:type="dxa"/>
+              <w:left w:w="80" w:type="dxa"/>
+              <w:bottom w:w="40" w:type="dxa"/>
+              <w:right w:w="80" w:type="dxa"/>
+            </w:tcMar>
+          </w:tcPr>
+          <w:p>
+            <w:r>
+              <w:rPr>
+                <w:sz w:val="18"/>
+                <w:szCs w:val="18"/>
+              </w:rPr>
+              <w:t>401 (유효한 토큰이 없습니다)</w:t>
+            </w:r>
+          </w:p>
+        </w:tc>
+      </w:tr>
+      <w:tr>
+        <w:tc>
+          <w:tcPr>
+            <w:tcW w:w="3964" w:type="dxa"/>
+            <w:tcMar>
+              <w:top w:w="40" w:type="dxa"/>
+              <w:left w:w="80" w:type="dxa"/>
+              <w:bottom w:w="40" w:type="dxa"/>
+              <w:right w:w="80" w:type="dxa"/>
+            </w:tcMar>
+          </w:tcPr>
+          <w:p>
+            <w:r>
+              <w:rPr>
+                <w:sz w:val="18"/>
+                <w:szCs w:val="18"/>
+              </w:rPr>
+              <w:t>유효한 refresh 토큰으로 /refresh</w:t>
+            </w:r>
+          </w:p>
+        </w:tc>
+        <w:tc>
+          <w:tcPr>
+            <w:tcW w:w="5036" w:type="dxa"/>
+            <w:tcMar>
+              <w:top w:w="40" w:type="dxa"/>
+              <w:left w:w="80" w:type="dxa"/>
+              <w:bottom w:w="40" w:type="dxa"/>
+              <w:right w:w="80" w:type="dxa"/>
+            </w:tcMar>
+          </w:tcPr>
+          <w:p>
+            <w:r>
+              <w:rPr>
+                <w:sz w:val="18"/>
+                <w:szCs w:val="18"/>
+              </w:rPr>
+              <w:t>200 — 새 access 발급</w:t>
+            </w:r>
+          </w:p>
+        </w:tc>
+      </w:tr>
+    </w:tbl>
+    <w:p>
+      <w:pPr>
+        <w:spacing w:after="80" w:line="272" w:lineRule="auto"/>
+      </w:pPr>
+      <w:r>
         <w:rPr>
           <w:b/>
           <w:bCs/>
@@ -6055,55 +6774,7 @@
           <w:sz w:val="18"/>
           <w:szCs w:val="18"/>
         </w:rPr>
-        <w:t xml:space="preserve">  "refreshToken": "&lt;</w:t>
-      </w:r>
-      <w:r>
-        <w:rPr>
-          <w:rFonts w:ascii="Consolas" w:hAnsi="Consolas"/>
-          <w:sz w:val="18"/>
-          <w:szCs w:val="18"/>
-        </w:rPr>
-        <w:t>로그인</w:t>
-      </w:r>
-      <w:r>
-        <w:rPr>
-          <w:rFonts w:ascii="Consolas" w:hAnsi="Consolas"/>
-          <w:sz w:val="18"/>
-          <w:szCs w:val="18"/>
-        </w:rPr>
-        <w:t xml:space="preserve"> </w:t>
-      </w:r>
-      <w:r>
-        <w:rPr>
-          <w:rFonts w:ascii="Consolas" w:hAnsi="Consolas"/>
-          <w:sz w:val="18"/>
-          <w:szCs w:val="18"/>
-        </w:rPr>
-        <w:t>응답으로</w:t>
-      </w:r>
-      <w:r>
-        <w:rPr>
-          <w:rFonts w:ascii="Consolas" w:hAnsi="Consolas"/>
-          <w:sz w:val="18"/>
-          <w:szCs w:val="18"/>
-        </w:rPr>
-        <w:t xml:space="preserve"> </w:t>
-      </w:r>
-      <w:r>
-        <w:rPr>
-          <w:rFonts w:ascii="Consolas" w:hAnsi="Consolas"/>
-          <w:sz w:val="18"/>
-          <w:szCs w:val="18"/>
-        </w:rPr>
-        <w:t>받은</w:t>
-      </w:r>
-      <w:r>
-        <w:rPr>
-          <w:rFonts w:ascii="Consolas" w:hAnsi="Consolas"/>
-          <w:sz w:val="18"/>
-          <w:szCs w:val="18"/>
-        </w:rPr>
-        <w:t xml:space="preserve"> refreshToken&gt;"</w:t>
+        <w:t xml:space="preserve">  "refreshToken": "&lt;로그인 응답으로 받은 refreshToken&gt;"</w:t>
       </w:r>
     </w:p>
     <w:p>
@@ -6147,6 +6818,7 @@
         <w:rPr>
           <w:noProof/>
         </w:rPr>
+        <w:lastRenderedPageBreak/>
         <w:drawing>
           <wp:inline distT="0" distB="0" distL="0" distR="0" wp14:anchorId="7D8A124F" wp14:editId="7B344AE2">
             <wp:extent cx="6036310" cy="2811145"/>
@@ -6197,14 +6869,7 @@
           <w:b/>
           <w:bCs/>
         </w:rPr>
-        <w:t>Refresh</w:t>
-      </w:r>
-      <w:r>
-        <w:rPr>
-          <w:b/>
-          <w:bCs/>
-        </w:rPr>
-        <w:t xml:space="preserve"> </w:t>
+        <w:t xml:space="preserve">Refresh </w:t>
       </w:r>
       <w:r>
         <w:rPr>
@@ -6214,21 +6879,12 @@
         </w:rPr>
         <w:t xml:space="preserve">요청 후에 </w:t>
       </w:r>
-      <w:proofErr w:type="spellStart"/>
       <w:r>
         <w:rPr>
           <w:b/>
           <w:bCs/>
         </w:rPr>
-        <w:t>refresh_token</w:t>
-      </w:r>
-      <w:proofErr w:type="spellEnd"/>
-      <w:r>
-        <w:rPr>
-          <w:b/>
-          <w:bCs/>
-        </w:rPr>
-        <w:t xml:space="preserve"> </w:t>
+        <w:t xml:space="preserve">refresh_token </w:t>
       </w:r>
       <w:r>
         <w:rPr>
@@ -6236,38 +6892,19 @@
           <w:b/>
           <w:bCs/>
         </w:rPr>
-        <w:t xml:space="preserve">테이블에 </w:t>
-      </w:r>
-      <w:r>
-        <w:rPr>
-          <w:rFonts w:hint="eastAsia"/>
+        <w:t xml:space="preserve">테이블에 갱신된 </w:t>
+      </w:r>
+      <w:r>
+        <w:rPr>
           <w:b/>
           <w:bCs/>
         </w:rPr>
-        <w:t>갱신된</w:t>
-      </w:r>
-      <w:r>
-        <w:rPr>
-          <w:rFonts w:hint="eastAsia"/>
-          <w:b/>
-          <w:bCs/>
-        </w:rPr>
-        <w:t xml:space="preserve"> </w:t>
-      </w:r>
-      <w:r>
-        <w:rPr>
-          <w:b/>
-          <w:bCs/>
-        </w:rPr>
         <w:t>refresh token</w:t>
       </w:r>
     </w:p>
     <w:p>
       <w:pPr>
         <w:spacing w:after="80" w:line="272" w:lineRule="auto"/>
-        <w:rPr>
-          <w:rFonts w:hint="eastAsia"/>
-        </w:rPr>
       </w:pPr>
       <w:r>
         <w:rPr>
@@ -6316,14 +6953,6 @@
           <w:b/>
           <w:bCs/>
         </w:rPr>
-        <w:br w:type="page"/>
-      </w:r>
-      <w:r>
-        <w:rPr>
-          <w:b/>
-          <w:bCs/>
-        </w:rPr>
-        <w:lastRenderedPageBreak/>
         <w:t xml:space="preserve">②-1. </w:t>
       </w:r>
       <w:r>
@@ -6415,10 +7044,159 @@
         <w:spacing w:after="80" w:line="272" w:lineRule="auto"/>
       </w:pPr>
       <w:r>
+        <w:t>발급된 적 없는 임의의 문자열을 refresh 토큰으로 보내면, DB(refresh_token 테이블)에서 해시가 일치하는 레코드를 찾지 못해 거부된다.</w:t>
+      </w:r>
+    </w:p>
+    <w:p>
+      <w:pPr>
+        <w:pBdr>
+          <w:top w:val="single" w:sz="4" w:space="3" w:color="D9D9D9"/>
+          <w:left w:val="single" w:sz="18" w:space="6" w:color="C0C0C0"/>
+          <w:bottom w:val="single" w:sz="4" w:space="3" w:color="D9D9D9"/>
+        </w:pBdr>
+        <w:shd w:val="clear" w:color="auto" w:fill="F4F4F4"/>
+      </w:pPr>
+      <w:r>
+        <w:rPr>
+          <w:rFonts w:ascii="Consolas" w:hAnsi="Consolas"/>
+          <w:sz w:val="18"/>
+          <w:szCs w:val="18"/>
+        </w:rPr>
+        <w:t>curl -s -w "\n%{http_code}\n" "$B/api/userinfos/refresh" -H "Content-Type: application/json" -d '{"refreshToken":"garbage-not-issued-0000"}'</w:t>
+      </w:r>
+    </w:p>
+    <w:tbl>
+      <w:tblPr>
+        <w:tblW w:w="9000" w:type="dxa"/>
+        <w:tblBorders>
+          <w:top w:val="single" w:sz="4" w:space="0" w:color="BFBFBF"/>
+          <w:left w:val="single" w:sz="4" w:space="0" w:color="BFBFBF"/>
+          <w:bottom w:val="single" w:sz="4" w:space="0" w:color="BFBFBF"/>
+          <w:right w:val="single" w:sz="4" w:space="0" w:color="BFBFBF"/>
+          <w:insideH w:val="single" w:sz="4" w:space="0" w:color="BFBFBF"/>
+          <w:insideV w:val="single" w:sz="4" w:space="0" w:color="BFBFBF"/>
+        </w:tblBorders>
+        <w:tblLook w:val="04A0" w:firstRow="1" w:lastRow="0" w:firstColumn="1" w:lastColumn="0" w:noHBand="0" w:noVBand="1"/>
+      </w:tblPr>
+      <w:tblGrid>
+        <w:gridCol w:w="3964"/>
+        <w:gridCol w:w="5036"/>
+      </w:tblGrid>
+      <w:tr>
+        <w:trPr>
+          <w:tblHeader/>
+        </w:trPr>
+        <w:tc>
+          <w:tcPr>
+            <w:tcW w:w="3964" w:type="dxa"/>
+            <w:shd w:val="clear" w:color="auto" w:fill="2E5496"/>
+            <w:tcMar>
+              <w:top w:w="40" w:type="dxa"/>
+              <w:left w:w="80" w:type="dxa"/>
+              <w:bottom w:w="40" w:type="dxa"/>
+              <w:right w:w="80" w:type="dxa"/>
+            </w:tcMar>
+          </w:tcPr>
+          <w:p>
+            <w:r>
+              <w:rPr>
+                <w:b/>
+                <w:bCs/>
+                <w:color w:val="FFFFFF"/>
+                <w:sz w:val="18"/>
+                <w:szCs w:val="18"/>
+              </w:rPr>
+              <w:t>요청</w:t>
+            </w:r>
+          </w:p>
+        </w:tc>
+        <w:tc>
+          <w:tcPr>
+            <w:tcW w:w="5036" w:type="dxa"/>
+            <w:shd w:val="clear" w:color="auto" w:fill="2E5496"/>
+            <w:tcMar>
+              <w:top w:w="40" w:type="dxa"/>
+              <w:left w:w="80" w:type="dxa"/>
+              <w:bottom w:w="40" w:type="dxa"/>
+              <w:right w:w="80" w:type="dxa"/>
+            </w:tcMar>
+          </w:tcPr>
+          <w:p>
+            <w:r>
+              <w:rPr>
+                <w:b/>
+                <w:bCs/>
+                <w:color w:val="FFFFFF"/>
+                <w:sz w:val="18"/>
+                <w:szCs w:val="18"/>
+              </w:rPr>
+              <w:t>결과</w:t>
+            </w:r>
+          </w:p>
+        </w:tc>
+      </w:tr>
+      <w:tr>
+        <w:tc>
+          <w:tcPr>
+            <w:tcW w:w="3964" w:type="dxa"/>
+            <w:tcMar>
+              <w:top w:w="40" w:type="dxa"/>
+              <w:left w:w="80" w:type="dxa"/>
+              <w:bottom w:w="40" w:type="dxa"/>
+              <w:right w:w="80" w:type="dxa"/>
+            </w:tcMar>
+          </w:tcPr>
+          <w:p>
+            <w:r>
+              <w:rPr>
+                <w:sz w:val="18"/>
+                <w:szCs w:val="18"/>
+              </w:rPr>
+              <w:t>발급된 적 없는 refresh 토큰으로 /refresh</w:t>
+            </w:r>
+          </w:p>
+        </w:tc>
+        <w:tc>
+          <w:tcPr>
+            <w:tcW w:w="5036" w:type="dxa"/>
+            <w:tcMar>
+              <w:top w:w="40" w:type="dxa"/>
+              <w:left w:w="80" w:type="dxa"/>
+              <w:bottom w:w="40" w:type="dxa"/>
+              <w:right w:w="80" w:type="dxa"/>
+            </w:tcMar>
+          </w:tcPr>
+          <w:p>
+            <w:r>
+              <w:rPr>
+                <w:sz w:val="18"/>
+                <w:szCs w:val="18"/>
+              </w:rPr>
+              <w:t>401 "유효하지 않은 refresh 토큰입니다"</w:t>
+            </w:r>
+          </w:p>
+        </w:tc>
+      </w:tr>
+    </w:tbl>
+    <w:p>
+      <w:pPr>
+        <w:spacing w:after="80" w:line="272" w:lineRule="auto"/>
         <w:rPr>
           <w:b/>
           <w:bCs/>
         </w:rPr>
+      </w:pPr>
+    </w:p>
+    <w:p>
+      <w:pPr>
+        <w:spacing w:after="80" w:line="272" w:lineRule="auto"/>
+      </w:pPr>
+      <w:r>
+        <w:rPr>
+          <w:b/>
+          <w:bCs/>
+        </w:rPr>
+        <w:lastRenderedPageBreak/>
         <w:t>③ 로그아웃 — POST /api/userinfos/logout</w:t>
       </w:r>
     </w:p>
@@ -6500,23 +7278,7 @@
           <w:sz w:val="18"/>
           <w:szCs w:val="18"/>
         </w:rPr>
-        <w:t xml:space="preserve">  "refreshToken": "&lt;</w:t>
-      </w:r>
-      <w:r>
-        <w:rPr>
-          <w:rFonts w:ascii="Consolas" w:hAnsi="Consolas"/>
-          <w:sz w:val="18"/>
-          <w:szCs w:val="18"/>
-        </w:rPr>
-        <w:t>폐기할</w:t>
-      </w:r>
-      <w:r>
-        <w:rPr>
-          <w:rFonts w:ascii="Consolas" w:hAnsi="Consolas"/>
-          <w:sz w:val="18"/>
-          <w:szCs w:val="18"/>
-        </w:rPr>
-        <w:t xml:space="preserve"> refreshToken&gt;"</w:t>
+        <w:t xml:space="preserve">  "refreshToken": "&lt;폐기할 refreshToken&gt;"</w:t>
       </w:r>
     </w:p>
     <w:p>
@@ -6618,14 +7380,7 @@
           <w:b/>
           <w:bCs/>
         </w:rPr>
-        <w:t>ogout</w:t>
-      </w:r>
-      <w:r>
-        <w:rPr>
-          <w:b/>
-          <w:bCs/>
-        </w:rPr>
-        <w:t xml:space="preserve"> </w:t>
+        <w:t xml:space="preserve">ogout </w:t>
       </w:r>
       <w:r>
         <w:rPr>
@@ -6635,21 +7390,12 @@
         </w:rPr>
         <w:t xml:space="preserve">요청 후에 </w:t>
       </w:r>
-      <w:proofErr w:type="spellStart"/>
       <w:r>
         <w:rPr>
           <w:b/>
           <w:bCs/>
         </w:rPr>
-        <w:t>refresh_token</w:t>
-      </w:r>
-      <w:proofErr w:type="spellEnd"/>
-      <w:r>
-        <w:rPr>
-          <w:b/>
-          <w:bCs/>
-        </w:rPr>
-        <w:t xml:space="preserve"> </w:t>
+        <w:t xml:space="preserve">refresh_token </w:t>
       </w:r>
       <w:r>
         <w:rPr>
@@ -6657,55 +7403,13 @@
           <w:b/>
           <w:bCs/>
         </w:rPr>
-        <w:t>테이블에</w:t>
-      </w:r>
-      <w:r>
-        <w:rPr>
-          <w:rFonts w:hint="eastAsia"/>
+        <w:t xml:space="preserve">테이블에서 삭제된 </w:t>
+      </w:r>
+      <w:r>
+        <w:rPr>
           <w:b/>
           <w:bCs/>
         </w:rPr>
-        <w:t>서</w:t>
-      </w:r>
-      <w:r>
-        <w:rPr>
-          <w:rFonts w:hint="eastAsia"/>
-          <w:b/>
-          <w:bCs/>
-        </w:rPr>
-        <w:t xml:space="preserve"> </w:t>
-      </w:r>
-      <w:r>
-        <w:rPr>
-          <w:rFonts w:hint="eastAsia"/>
-          <w:b/>
-          <w:bCs/>
-        </w:rPr>
-        <w:t>삭제</w:t>
-      </w:r>
-      <w:r>
-        <w:rPr>
-          <w:rFonts w:hint="eastAsia"/>
-          <w:b/>
-          <w:bCs/>
-        </w:rPr>
-        <w:t>된</w:t>
-      </w:r>
-      <w:bookmarkStart w:id="0" w:name="_GoBack"/>
-      <w:bookmarkEnd w:id="0"/>
-      <w:r>
-        <w:rPr>
-          <w:rFonts w:hint="eastAsia"/>
-          <w:b/>
-          <w:bCs/>
-        </w:rPr>
-        <w:t xml:space="preserve"> </w:t>
-      </w:r>
-      <w:r>
-        <w:rPr>
-          <w:b/>
-          <w:bCs/>
-        </w:rPr>
         <w:t>refresh token</w:t>
       </w:r>
     </w:p>
@@ -6713,7 +7417,6 @@
       <w:pPr>
         <w:spacing w:after="80" w:line="272" w:lineRule="auto"/>
         <w:rPr>
-          <w:rFonts w:hint="eastAsia"/>
           <w:b/>
           <w:bCs/>
         </w:rPr>
@@ -6768,39 +7471,729 @@
           <w:b/>
           <w:bCs/>
         </w:rPr>
-        <w:t>참고) 인증이 필요한 일반 API 호출 — GET /</w:t>
-      </w:r>
-      <w:proofErr w:type="spellStart"/>
-      <w:r>
+        <w:t>④ 1단계 방식 위조 토큰으로 재시도 — GET /api/userinfos/me</w:t>
+      </w:r>
+    </w:p>
+    <w:p>
+      <w:pPr>
+        <w:spacing w:after="80" w:line="272" w:lineRule="auto"/>
+      </w:pPr>
+      <w:r>
+        <w:t>secret 이 유출된 상태를 가정하고, 1단계와 동일한 방식(sub 에 email 을 넣어 서명)으로 위조한 토큰을 이 2단계 서버에 제시한다. 비교를 위해, 같은 secret·같은 서명 방식으로 실제 사용자의 uuid 를 sub 에 넣어 위조한 토큰도 함께 시도한다.</w:t>
+      </w:r>
+    </w:p>
+    <w:p>
+      <w:pPr>
+        <w:pBdr>
+          <w:top w:val="single" w:sz="4" w:space="3" w:color="D9D9D9"/>
+          <w:left w:val="single" w:sz="18" w:space="6" w:color="C0C0C0"/>
+          <w:bottom w:val="single" w:sz="4" w:space="3" w:color="D9D9D9"/>
+        </w:pBdr>
+        <w:shd w:val="clear" w:color="auto" w:fill="F4F4F4"/>
+        <w:rPr>
+          <w:rFonts w:ascii="Consolas" w:hAnsi="Consolas"/>
+          <w:sz w:val="18"/>
+          <w:szCs w:val="18"/>
+        </w:rPr>
+      </w:pPr>
+      <w:r>
+        <w:rPr>
+          <w:rFonts w:ascii="Consolas" w:hAnsi="Consolas"/>
+          <w:sz w:val="18"/>
+          <w:szCs w:val="18"/>
+        </w:rPr>
+        <w:t>LOGIN=$(curl -s "$B/api/userinfos/login" -H "Content-Type: application/json" -d '{"email":"admin@aa.com","password":"pwd1"}')</w:t>
+      </w:r>
+    </w:p>
+    <w:p>
+      <w:pPr>
+        <w:pBdr>
+          <w:top w:val="single" w:sz="4" w:space="3" w:color="D9D9D9"/>
+          <w:left w:val="single" w:sz="18" w:space="6" w:color="C0C0C0"/>
+          <w:bottom w:val="single" w:sz="4" w:space="3" w:color="D9D9D9"/>
+        </w:pBdr>
+        <w:shd w:val="clear" w:color="auto" w:fill="F4F4F4"/>
+      </w:pPr>
+    </w:p>
+    <w:p>
+      <w:pPr>
+        <w:pBdr>
+          <w:top w:val="single" w:sz="4" w:space="3" w:color="D9D9D9"/>
+          <w:left w:val="single" w:sz="18" w:space="6" w:color="C0C0C0"/>
+          <w:bottom w:val="single" w:sz="4" w:space="3" w:color="D9D9D9"/>
+        </w:pBdr>
+        <w:shd w:val="clear" w:color="auto" w:fill="F4F4F4"/>
+      </w:pPr>
+      <w:r>
+        <w:rPr>
+          <w:rFonts w:ascii="Consolas" w:hAnsi="Consolas"/>
+          <w:sz w:val="18"/>
+          <w:szCs w:val="18"/>
+        </w:rPr>
+        <w:t xml:space="preserve">UUID=$(echo "$LOGIN" | python -c "import sys,json;print(json.load(sys.stdin)['accessToken'])" | cut -d. -f2 | python -c "import sys,base64,json;s=sys.stdin.read().strip();s+='='*(-len(s)%4);print(json.loads(base64.urlsafe_b64decode(s))['sub'])")</w:t>
+      </w:r>
+    </w:p>
+    <w:p>
+      <w:pPr>
+        <w:pBdr>
+          <w:top w:val="single" w:sz="4" w:space="18" w:color="D9D9D9"/>
+          <w:left w:val="single" w:sz="18" w:space="6" w:color="C0C0C0"/>
+          <w:bottom w:val="single" w:sz="4" w:space="3" w:color="D9D9D9"/>
+        </w:pBdr>
+        <w:shd w:val="clear" w:color="auto" w:fill="F4F4F4"/>
+        <w:rPr>
+          <w:rFonts w:ascii="Consolas" w:hAnsi="Consolas"/>
+          <w:sz w:val="18"/>
+          <w:szCs w:val="18"/>
+        </w:rPr>
+      </w:pPr>
+      <w:r>
+        <w:rPr>
+          <w:rFonts w:ascii="Consolas" w:hAnsi="Consolas"/>
+          <w:sz w:val="18"/>
+          <w:szCs w:val="18"/>
+        </w:rPr>
+        <w:t>FT_UUID=$(python docs/security/jwt_forge.py "$UUID")</w:t>
+      </w:r>
+    </w:p>
+    <w:p>
+      <w:pPr>
+        <w:pBdr>
+          <w:top w:val="single" w:sz="4" w:space="18" w:color="D9D9D9"/>
+          <w:left w:val="single" w:sz="18" w:space="6" w:color="C0C0C0"/>
+          <w:bottom w:val="single" w:sz="4" w:space="3" w:color="D9D9D9"/>
+        </w:pBdr>
+        <w:shd w:val="clear" w:color="auto" w:fill="F4F4F4"/>
+        <w:rPr>
+          <w:rFonts w:ascii="Consolas" w:hAnsi="Consolas"/>
+          <w:sz w:val="18"/>
+          <w:szCs w:val="18"/>
+        </w:rPr>
+      </w:pPr>
+      <w:r>
+        <w:rPr>
+          <w:rFonts w:ascii="Consolas" w:hAnsi="Consolas"/>
+          <w:sz w:val="18"/>
+          <w:szCs w:val="18"/>
+        </w:rPr>
+        <w:t>curl -s -w "\n%{http_code}\n" "$B/api/userinfos/me" -H "Authorization: Bearer $FT_UUID"</w:t>
+      </w:r>
+    </w:p>
+    <w:p>
+      <w:pPr>
+        <w:pBdr>
+          <w:top w:val="single" w:sz="4" w:space="18" w:color="D9D9D9"/>
+          <w:left w:val="single" w:sz="18" w:space="6" w:color="C0C0C0"/>
+          <w:bottom w:val="single" w:sz="4" w:space="3" w:color="D9D9D9"/>
+        </w:pBdr>
+        <w:shd w:val="clear" w:color="auto" w:fill="F4F4F4"/>
+      </w:pPr>
+    </w:p>
+    <w:p>
+      <w:pPr>
+        <w:pBdr>
+          <w:top w:val="single" w:sz="4" w:space="18" w:color="D9D9D9"/>
+          <w:left w:val="single" w:sz="18" w:space="6" w:color="C0C0C0"/>
+          <w:bottom w:val="single" w:sz="4" w:space="3" w:color="D9D9D9"/>
+        </w:pBdr>
+        <w:shd w:val="clear" w:color="auto" w:fill="F4F4F4"/>
+      </w:pPr>
+      <w:r>
+        <w:rPr>
+          <w:rFonts w:ascii="Consolas" w:hAnsi="Consolas"/>
+          <w:sz w:val="18"/>
+          <w:szCs w:val="18"/>
+        </w:rPr>
+        <w:t>FT_EMAIL=$(python docs/security/jwt_forge.py admin@aa.com)</w:t>
+      </w:r>
+    </w:p>
+    <w:p>
+      <w:pPr>
+        <w:pBdr>
+          <w:top w:val="single" w:sz="4" w:space="18" w:color="D9D9D9"/>
+          <w:left w:val="single" w:sz="18" w:space="6" w:color="C0C0C0"/>
+          <w:bottom w:val="single" w:sz="4" w:space="3" w:color="D9D9D9"/>
+        </w:pBdr>
+        <w:shd w:val="clear" w:color="auto" w:fill="F4F4F4"/>
+        <w:rPr>
+          <w:rFonts w:ascii="Consolas" w:hAnsi="Consolas"/>
+          <w:sz w:val="18"/>
+          <w:szCs w:val="18"/>
+        </w:rPr>
+      </w:pPr>
+      <w:r>
+        <w:rPr>
+          <w:rFonts w:ascii="Consolas" w:hAnsi="Consolas"/>
+          <w:sz w:val="18"/>
+          <w:szCs w:val="18"/>
+        </w:rPr>
+        <w:t>curl -s -w "\n%{http_code}\n" "$B/api/userinfos/me" -H "Authorization: Bearer $FT_EMAIL"</w:t>
+      </w:r>
+    </w:p>
+    <w:p>
+      <w:pPr>
+        <w:pBdr>
+          <w:top w:val="single" w:sz="4" w:space="18" w:color="D9D9D9"/>
+          <w:left w:val="single" w:sz="18" w:space="6" w:color="C0C0C0"/>
+          <w:bottom w:val="single" w:sz="4" w:space="3" w:color="D9D9D9"/>
+        </w:pBdr>
+        <w:shd w:val="clear" w:color="auto" w:fill="F4F4F4"/>
+      </w:pPr>
+    </w:p>
+    <w:tbl>
+      <w:tblPr>
+        <w:tblW w:w="9000" w:type="dxa"/>
+        <w:tblBorders>
+          <w:top w:val="single" w:sz="4" w:space="0" w:color="BFBFBF"/>
+          <w:left w:val="single" w:sz="4" w:space="0" w:color="BFBFBF"/>
+          <w:bottom w:val="single" w:sz="4" w:space="0" w:color="BFBFBF"/>
+          <w:right w:val="single" w:sz="4" w:space="0" w:color="BFBFBF"/>
+          <w:insideH w:val="single" w:sz="4" w:space="0" w:color="BFBFBF"/>
+          <w:insideV w:val="single" w:sz="4" w:space="0" w:color="BFBFBF"/>
+        </w:tblBorders>
+        <w:tblLook w:val="04A0" w:firstRow="1" w:lastRow="0" w:firstColumn="1" w:lastColumn="0" w:noHBand="0" w:noVBand="1"/>
+      </w:tblPr>
+      <w:tblGrid>
+        <w:gridCol w:w="3964"/>
+        <w:gridCol w:w="5036"/>
+      </w:tblGrid>
+      <w:tr>
+        <w:trPr>
+          <w:tblHeader/>
+        </w:trPr>
+        <w:tc>
+          <w:tcPr>
+            <w:tcW w:w="3964" w:type="dxa"/>
+            <w:shd w:val="clear" w:color="auto" w:fill="2E5496"/>
+            <w:tcMar>
+              <w:top w:w="40" w:type="dxa"/>
+              <w:left w:w="80" w:type="dxa"/>
+              <w:bottom w:w="40" w:type="dxa"/>
+              <w:right w:w="80" w:type="dxa"/>
+            </w:tcMar>
+          </w:tcPr>
+          <w:p>
+            <w:r>
+              <w:rPr>
+                <w:b/>
+                <w:bCs/>
+                <w:color w:val="FFFFFF"/>
+                <w:sz w:val="18"/>
+                <w:szCs w:val="18"/>
+              </w:rPr>
+              <w:t>위조 방식</w:t>
+            </w:r>
+          </w:p>
+        </w:tc>
+        <w:tc>
+          <w:tcPr>
+            <w:tcW w:w="5036" w:type="dxa"/>
+            <w:shd w:val="clear" w:color="auto" w:fill="2E5496"/>
+            <w:tcMar>
+              <w:top w:w="40" w:type="dxa"/>
+              <w:left w:w="80" w:type="dxa"/>
+              <w:bottom w:w="40" w:type="dxa"/>
+              <w:right w:w="80" w:type="dxa"/>
+            </w:tcMar>
+          </w:tcPr>
+          <w:p>
+            <w:r>
+              <w:rPr>
+                <w:b/>
+                <w:bCs/>
+                <w:color w:val="FFFFFF"/>
+                <w:sz w:val="18"/>
+                <w:szCs w:val="18"/>
+              </w:rPr>
+              <w:t>결과</w:t>
+            </w:r>
+          </w:p>
+        </w:tc>
+      </w:tr>
+      <w:tr>
+        <w:tc>
+          <w:tcPr>
+            <w:tcW w:w="3964" w:type="dxa"/>
+            <w:tcMar>
+              <w:top w:w="40" w:type="dxa"/>
+              <w:left w:w="80" w:type="dxa"/>
+              <w:bottom w:w="40" w:type="dxa"/>
+              <w:right w:w="80" w:type="dxa"/>
+            </w:tcMar>
+          </w:tcPr>
+          <w:p>
+            <w:r>
+              <w:rPr>
+                <w:sz w:val="18"/>
+                <w:szCs w:val="18"/>
+              </w:rPr>
+              <w:t>sub=실제 uuid (같은 secret)</w:t>
+            </w:r>
+          </w:p>
+        </w:tc>
+        <w:tc>
+          <w:tcPr>
+            <w:tcW w:w="5036" w:type="dxa"/>
+            <w:tcMar>
+              <w:top w:w="40" w:type="dxa"/>
+              <w:left w:w="80" w:type="dxa"/>
+              <w:bottom w:w="40" w:type="dxa"/>
+              <w:right w:w="80" w:type="dxa"/>
+            </w:tcMar>
+          </w:tcPr>
+          <w:p>
+            <w:r>
+              <w:rPr>
+                <w:sz w:val="18"/>
+                <w:szCs w:val="18"/>
+              </w:rPr>
+              <w:t>200 — 서명·uuid 모두 일치 → 인증됨</w:t>
+            </w:r>
+          </w:p>
+        </w:tc>
+      </w:tr>
+      <w:tr>
+        <w:tc>
+          <w:tcPr>
+            <w:tcW w:w="3964" w:type="dxa"/>
+            <w:tcMar>
+              <w:top w:w="40" w:type="dxa"/>
+              <w:left w:w="80" w:type="dxa"/>
+              <w:bottom w:w="40" w:type="dxa"/>
+              <w:right w:w="80" w:type="dxa"/>
+            </w:tcMar>
+          </w:tcPr>
+          <w:p>
+            <w:r>
+              <w:rPr>
+                <w:sz w:val="18"/>
+                <w:szCs w:val="18"/>
+              </w:rPr>
+              <w:t>sub=email, 1단계 방식 (같은 secret)</w:t>
+            </w:r>
+          </w:p>
+        </w:tc>
+        <w:tc>
+          <w:tcPr>
+            <w:tcW w:w="5036" w:type="dxa"/>
+            <w:tcMar>
+              <w:top w:w="40" w:type="dxa"/>
+              <w:left w:w="80" w:type="dxa"/>
+              <w:bottom w:w="40" w:type="dxa"/>
+              <w:right w:w="80" w:type="dxa"/>
+            </w:tcMar>
+          </w:tcPr>
+          <w:p>
+            <w:r>
+              <w:rPr>
+                <w:sz w:val="18"/>
+                <w:szCs w:val="18"/>
+              </w:rPr>
+              <w:t>401 — 서명은 유효하지만 그런 uuid 를 가진 사용자가 없음</w:t>
+            </w:r>
+          </w:p>
+        </w:tc>
+      </w:tr>
+    </w:tbl>
+    <w:p>
+      <w:pPr>
+        <w:spacing w:after="80" w:line="272" w:lineRule="auto"/>
+      </w:pPr>
+      <w:r>
+        <w:t>→ 두 토큰 모두 같은 secret 으로 유효하게 서명됐다. 차이는 오직 sub 에 담긴 값뿐이다 — uuid 전환이 "서명 위조 자체"가 아니라 "위조해서 흉내 낼 수 있는 대상(공격 범위)"을 차단한다는 것을 보여준다.</w:t>
+      </w:r>
+    </w:p>
+    <w:p>
+      <w:pPr>
+        <w:spacing w:after="80" w:line="272" w:lineRule="auto"/>
         <w:rPr>
           <w:b/>
           <w:bCs/>
         </w:rPr>
-        <w:t>api</w:t>
-      </w:r>
-      <w:proofErr w:type="spellEnd"/>
+      </w:pPr>
+    </w:p>
+    <w:p>
+      <w:pPr>
+        <w:spacing w:after="80" w:line="272" w:lineRule="auto"/>
+      </w:pPr>
       <w:r>
         <w:rPr>
           <w:b/>
           <w:bCs/>
         </w:rPr>
-        <w:t>/</w:t>
-      </w:r>
-      <w:proofErr w:type="spellStart"/>
+        <w:lastRenderedPageBreak/>
+        <w:t>⑤ Refresh 토큰 재사용 탐지 — POST /api/userinfos/refresh</w:t>
+      </w:r>
+    </w:p>
+    <w:p>
+      <w:pPr>
+        <w:spacing w:after="80" w:line="272" w:lineRule="auto"/>
+      </w:pPr>
+      <w:r>
+        <w:t>회전으로 이미 폐기된(한 번 쓰인) refresh 토큰을 다시 제출하면 재사용으로 간주돼 거부되고, 그 사용자의 모든 refresh 토큰이 함께 폐기된다 — 회전으로 막 받은, 아직 쓰지 않은 최신 토큰도 예외가 아니다.</w:t>
+      </w:r>
+    </w:p>
+    <w:p>
+      <w:pPr>
+        <w:pBdr>
+          <w:top w:val="single" w:sz="4" w:space="3" w:color="D9D9D9"/>
+          <w:left w:val="single" w:sz="18" w:space="6" w:color="C0C0C0"/>
+          <w:bottom w:val="single" w:sz="4" w:space="3" w:color="D9D9D9"/>
+        </w:pBdr>
+        <w:shd w:val="clear" w:color="auto" w:fill="F4F4F4"/>
+        <w:rPr>
+          <w:rFonts w:ascii="Consolas" w:hAnsi="Consolas"/>
+          <w:sz w:val="18"/>
+          <w:szCs w:val="18"/>
+        </w:rPr>
+      </w:pPr>
+      <w:r>
+        <w:rPr>
+          <w:rFonts w:ascii="Consolas" w:hAnsi="Consolas"/>
+          <w:sz w:val="18"/>
+          <w:szCs w:val="18"/>
+        </w:rPr>
+        <w:t>LOGIN=$(curl -s "$B/api/userinfos/login" -H "Content-Type: application/json" -d '{"email":"admin@aa.com","password":"pwd1"}')</w:t>
+      </w:r>
+    </w:p>
+    <w:p>
+      <w:pPr>
+        <w:pBdr>
+          <w:top w:val="single" w:sz="4" w:space="3" w:color="D9D9D9"/>
+          <w:left w:val="single" w:sz="18" w:space="6" w:color="C0C0C0"/>
+          <w:bottom w:val="single" w:sz="4" w:space="3" w:color="D9D9D9"/>
+        </w:pBdr>
+        <w:shd w:val="clear" w:color="auto" w:fill="F4F4F4"/>
+      </w:pPr>
+    </w:p>
+    <w:p>
+      <w:pPr>
+        <w:pBdr>
+          <w:top w:val="single" w:sz="4" w:space="3" w:color="D9D9D9"/>
+          <w:left w:val="single" w:sz="18" w:space="6" w:color="C0C0C0"/>
+          <w:bottom w:val="single" w:sz="4" w:space="3" w:color="D9D9D9"/>
+        </w:pBdr>
+        <w:shd w:val="clear" w:color="auto" w:fill="F4F4F4"/>
+      </w:pPr>
+      <w:r>
+        <w:rPr>
+          <w:rFonts w:ascii="Consolas" w:hAnsi="Consolas"/>
+          <w:sz w:val="18"/>
+          <w:szCs w:val="18"/>
+        </w:rPr>
+        <w:t xml:space="preserve">R1=$(echo "$LOGIN" | python -c "import sys,json;print(json.load(sys.stdin)['refreshToken'])")   # 최초 refresh</w:t>
+      </w:r>
+    </w:p>
+    <w:p>
+      <w:pPr>
+        <w:pBdr>
+          <w:top w:val="single" w:sz="4" w:space="3" w:color="D9D9D9"/>
+          <w:left w:val="single" w:sz="18" w:space="6" w:color="C0C0C0"/>
+          <w:bottom w:val="single" w:sz="4" w:space="3" w:color="D9D9D9"/>
+        </w:pBdr>
+        <w:shd w:val="clear" w:color="auto" w:fill="F4F4F4"/>
+        <w:rPr>
+          <w:rFonts w:ascii="Consolas" w:hAnsi="Consolas"/>
+          <w:sz w:val="18"/>
+          <w:szCs w:val="18"/>
+        </w:rPr>
+      </w:pPr>
+      <w:r>
+        <w:rPr>
+          <w:rFonts w:ascii="Consolas" w:hAnsi="Consolas"/>
+          <w:sz w:val="18"/>
+          <w:szCs w:val="18"/>
+        </w:rPr>
+        <w:t xml:space="preserve">ROT1=$(curl -s "$B/api/userinfos/refresh" -H "Content-Type: application/json" -d "{\"refreshToken\":\"$R1\"}")   # 200, R1 회전</w:t>
+      </w:r>
+    </w:p>
+    <w:p>
+      <w:pPr>
+        <w:pBdr>
+          <w:top w:val="single" w:sz="4" w:space="3" w:color="D9D9D9"/>
+          <w:left w:val="single" w:sz="18" w:space="6" w:color="C0C0C0"/>
+          <w:bottom w:val="single" w:sz="4" w:space="3" w:color="D9D9D9"/>
+        </w:pBdr>
+        <w:shd w:val="clear" w:color="auto" w:fill="F4F4F4"/>
+        <w:rPr>
+          <w:rFonts w:ascii="Consolas" w:hAnsi="Consolas"/>
+          <w:sz w:val="18"/>
+          <w:szCs w:val="18"/>
+        </w:rPr>
+      </w:pPr>
+    </w:p>
+    <w:p>
+      <w:pPr>
+        <w:pBdr>
+          <w:top w:val="single" w:sz="4" w:space="3" w:color="D9D9D9"/>
+          <w:left w:val="single" w:sz="18" w:space="6" w:color="C0C0C0"/>
+          <w:bottom w:val="single" w:sz="4" w:space="3" w:color="D9D9D9"/>
+        </w:pBdr>
+        <w:shd w:val="clear" w:color="auto" w:fill="F4F4F4"/>
+      </w:pPr>
+      <w:r>
+        <w:rPr>
+          <w:rFonts w:ascii="Consolas" w:hAnsi="Consolas"/>
+          <w:sz w:val="18"/>
+          <w:szCs w:val="18"/>
+        </w:rPr>
+        <w:t xml:space="preserve"># 회전으로 받은 최신 토큰</w:t>
+      </w:r>
+    </w:p>
+    <w:p>
+      <w:pPr>
+        <w:pBdr>
+          <w:top w:val="single" w:sz="4" w:space="3" w:color="D9D9D9"/>
+          <w:left w:val="single" w:sz="18" w:space="6" w:color="C0C0C0"/>
+          <w:bottom w:val="single" w:sz="4" w:space="3" w:color="D9D9D9"/>
+        </w:pBdr>
+        <w:shd w:val="clear" w:color="auto" w:fill="F4F4F4"/>
+        <w:rPr>
+          <w:rFonts w:ascii="Consolas" w:hAnsi="Consolas"/>
+          <w:sz w:val="18"/>
+          <w:szCs w:val="18"/>
+        </w:rPr>
+      </w:pPr>
+      <w:r>
+        <w:rPr>
+          <w:rFonts w:ascii="Consolas" w:hAnsi="Consolas"/>
+          <w:sz w:val="18"/>
+          <w:szCs w:val="18"/>
+        </w:rPr>
+        <w:t xml:space="preserve">R2=$(echo "$ROT1" | python -c "import sys,json;print(json.load(sys.stdin)['refreshToken'])")</w:t>
+      </w:r>
+    </w:p>
+    <w:p>
+      <w:pPr>
+        <w:pBdr>
+          <w:top w:val="single" w:sz="4" w:space="3" w:color="D9D9D9"/>
+          <w:left w:val="single" w:sz="18" w:space="6" w:color="C0C0C0"/>
+          <w:bottom w:val="single" w:sz="4" w:space="3" w:color="D9D9D9"/>
+        </w:pBdr>
+        <w:shd w:val="clear" w:color="auto" w:fill="F4F4F4"/>
+        <w:rPr>
+          <w:rFonts w:ascii="Consolas" w:hAnsi="Consolas"/>
+          <w:sz w:val="18"/>
+          <w:szCs w:val="18"/>
+        </w:rPr>
+      </w:pPr>
+    </w:p>
+    <w:p>
+      <w:pPr>
+        <w:pBdr>
+          <w:top w:val="single" w:sz="4" w:space="3" w:color="D9D9D9"/>
+          <w:left w:val="single" w:sz="18" w:space="6" w:color="C0C0C0"/>
+          <w:bottom w:val="single" w:sz="4" w:space="3" w:color="D9D9D9"/>
+        </w:pBdr>
+        <w:shd w:val="clear" w:color="auto" w:fill="F4F4F4"/>
+        <w:rPr>
+          <w:rFonts w:ascii="Consolas" w:hAnsi="Consolas"/>
+          <w:sz w:val="18"/>
+          <w:szCs w:val="18"/>
+        </w:rPr>
+      </w:pPr>
+      <w:r>
+        <w:rPr>
+          <w:rFonts w:ascii="Consolas" w:hAnsi="Consolas"/>
+          <w:sz w:val="18"/>
+          <w:szCs w:val="18"/>
+        </w:rPr>
+        <w:t xml:space="preserve">curl -s -w "\n%{http_code}\n" "$B/api/userinfos/refresh" -H "Content-Type: application/json" -d "{\"refreshToken\":\"$R1\"}"   # 이미 폐기된 R1 재사용</w:t>
+      </w:r>
+    </w:p>
+    <w:p>
+      <w:pPr>
+        <w:pBdr>
+          <w:top w:val="single" w:sz="4" w:space="3" w:color="D9D9D9"/>
+          <w:left w:val="single" w:sz="18" w:space="6" w:color="C0C0C0"/>
+          <w:bottom w:val="single" w:sz="4" w:space="3" w:color="D9D9D9"/>
+        </w:pBdr>
+        <w:shd w:val="clear" w:color="auto" w:fill="F4F4F4"/>
+      </w:pPr>
+    </w:p>
+    <w:p>
+      <w:pPr>
+        <w:pBdr>
+          <w:top w:val="single" w:sz="4" w:space="3" w:color="D9D9D9"/>
+          <w:left w:val="single" w:sz="18" w:space="6" w:color="C0C0C0"/>
+          <w:bottom w:val="single" w:sz="4" w:space="3" w:color="D9D9D9"/>
+        </w:pBdr>
+        <w:shd w:val="clear" w:color="auto" w:fill="F4F4F4"/>
+      </w:pPr>
+      <w:r>
+        <w:rPr>
+          <w:rFonts w:ascii="Consolas" w:hAnsi="Consolas"/>
+          <w:sz w:val="18"/>
+          <w:szCs w:val="18"/>
+        </w:rPr>
+        <w:t xml:space="preserve">curl -s -w "\n%{http_code}\n" "$B/api/userinfos/refresh" -H "Content-Type: application/json" -d "{\"refreshToken\":\"$R2\"}"   # 아직 안 쓴 최신 토큰</w:t>
+      </w:r>
+    </w:p>
+    <w:tbl>
+      <w:tblPr>
+        <w:tblW w:w="9000" w:type="dxa"/>
+        <w:tblBorders>
+          <w:top w:val="single" w:sz="4" w:space="0" w:color="BFBFBF"/>
+          <w:left w:val="single" w:sz="4" w:space="0" w:color="BFBFBF"/>
+          <w:bottom w:val="single" w:sz="4" w:space="0" w:color="BFBFBF"/>
+          <w:right w:val="single" w:sz="4" w:space="0" w:color="BFBFBF"/>
+          <w:insideH w:val="single" w:sz="4" w:space="0" w:color="BFBFBF"/>
+          <w:insideV w:val="single" w:sz="4" w:space="0" w:color="BFBFBF"/>
+        </w:tblBorders>
+        <w:tblLook w:val="04A0" w:firstRow="1" w:lastRow="0" w:firstColumn="1" w:lastColumn="0" w:noHBand="0" w:noVBand="1"/>
+      </w:tblPr>
+      <w:tblGrid>
+        <w:gridCol w:w="3964"/>
+        <w:gridCol w:w="5036"/>
+      </w:tblGrid>
+      <w:tr>
+        <w:trPr>
+          <w:tblHeader/>
+        </w:trPr>
+        <w:tc>
+          <w:tcPr>
+            <w:tcW w:w="3964" w:type="dxa"/>
+            <w:shd w:val="clear" w:color="auto" w:fill="2E5496"/>
+            <w:tcMar>
+              <w:top w:w="40" w:type="dxa"/>
+              <w:left w:w="80" w:type="dxa"/>
+              <w:bottom w:w="40" w:type="dxa"/>
+              <w:right w:w="80" w:type="dxa"/>
+            </w:tcMar>
+          </w:tcPr>
+          <w:p>
+            <w:r>
+              <w:rPr>
+                <w:b/>
+                <w:bCs/>
+                <w:color w:val="FFFFFF"/>
+                <w:sz w:val="18"/>
+                <w:szCs w:val="18"/>
+              </w:rPr>
+              <w:t>요청</w:t>
+            </w:r>
+          </w:p>
+        </w:tc>
+        <w:tc>
+          <w:tcPr>
+            <w:tcW w:w="5036" w:type="dxa"/>
+            <w:shd w:val="clear" w:color="auto" w:fill="2E5496"/>
+            <w:tcMar>
+              <w:top w:w="40" w:type="dxa"/>
+              <w:left w:w="80" w:type="dxa"/>
+              <w:bottom w:w="40" w:type="dxa"/>
+              <w:right w:w="80" w:type="dxa"/>
+            </w:tcMar>
+          </w:tcPr>
+          <w:p>
+            <w:r>
+              <w:rPr>
+                <w:b/>
+                <w:bCs/>
+                <w:color w:val="FFFFFF"/>
+                <w:sz w:val="18"/>
+                <w:szCs w:val="18"/>
+              </w:rPr>
+              <w:t>결과</w:t>
+            </w:r>
+          </w:p>
+        </w:tc>
+      </w:tr>
+      <w:tr>
+        <w:tc>
+          <w:tcPr>
+            <w:tcW w:w="3964" w:type="dxa"/>
+            <w:tcMar>
+              <w:top w:w="40" w:type="dxa"/>
+              <w:left w:w="80" w:type="dxa"/>
+              <w:bottom w:w="40" w:type="dxa"/>
+              <w:right w:w="80" w:type="dxa"/>
+            </w:tcMar>
+          </w:tcPr>
+          <w:p>
+            <w:r>
+              <w:rPr>
+                <w:sz w:val="18"/>
+                <w:szCs w:val="18"/>
+              </w:rPr>
+              <w:t>이미 회전으로 폐기된 R1 재사용</w:t>
+            </w:r>
+          </w:p>
+        </w:tc>
+        <w:tc>
+          <w:tcPr>
+            <w:tcW w:w="5036" w:type="dxa"/>
+            <w:tcMar>
+              <w:top w:w="40" w:type="dxa"/>
+              <w:left w:w="80" w:type="dxa"/>
+              <w:bottom w:w="40" w:type="dxa"/>
+              <w:right w:w="80" w:type="dxa"/>
+            </w:tcMar>
+          </w:tcPr>
+          <w:p>
+            <w:r>
+              <w:rPr>
+                <w:sz w:val="18"/>
+                <w:szCs w:val="18"/>
+              </w:rPr>
+              <w:t>401 "재사용이 감지되어 모든 세션이 종료되었습니다. 다시 로그인하세요"</w:t>
+            </w:r>
+          </w:p>
+        </w:tc>
+      </w:tr>
+      <w:tr>
+        <w:tc>
+          <w:tcPr>
+            <w:tcW w:w="3964" w:type="dxa"/>
+            <w:tcMar>
+              <w:top w:w="40" w:type="dxa"/>
+              <w:left w:w="80" w:type="dxa"/>
+              <w:bottom w:w="40" w:type="dxa"/>
+              <w:right w:w="80" w:type="dxa"/>
+            </w:tcMar>
+          </w:tcPr>
+          <w:p>
+            <w:r>
+              <w:rPr>
+                <w:sz w:val="18"/>
+                <w:szCs w:val="18"/>
+              </w:rPr>
+              <w:t>재사용 탐지 직후, 아직 쓰지 않은 R2 로 /refresh</w:t>
+            </w:r>
+          </w:p>
+        </w:tc>
+        <w:tc>
+          <w:tcPr>
+            <w:tcW w:w="5036" w:type="dxa"/>
+            <w:tcMar>
+              <w:top w:w="40" w:type="dxa"/>
+              <w:left w:w="80" w:type="dxa"/>
+              <w:bottom w:w="40" w:type="dxa"/>
+              <w:right w:w="80" w:type="dxa"/>
+            </w:tcMar>
+          </w:tcPr>
+          <w:p>
+            <w:r>
+              <w:rPr>
+                <w:sz w:val="18"/>
+                <w:szCs w:val="18"/>
+              </w:rPr>
+              <w:t>401 "유효하지 않은 refresh 토큰입니다" — 전체 폐기가 실제로 적용됨</w:t>
+            </w:r>
+          </w:p>
+        </w:tc>
+      </w:tr>
+    </w:tbl>
+    <w:p>
+      <w:pPr>
+        <w:spacing w:after="80" w:line="272" w:lineRule="auto"/>
+      </w:pPr>
       <w:r>
         <w:rPr>
           <w:b/>
           <w:bCs/>
         </w:rPr>
-        <w:t>userinfos</w:t>
-      </w:r>
-      <w:proofErr w:type="spellEnd"/>
-      <w:r>
-        <w:rPr>
-          <w:b/>
-          <w:bCs/>
-        </w:rPr>
-        <w:t>/me</w:t>
+        <w:t>참고) 인증이 필요한 일반 API 호출 — GET /api/userinfos/me</w:t>
       </w:r>
     </w:p>
     <w:p>
@@ -6851,6 +8244,25 @@
     </w:p>
     <w:p>
       <w:pPr>
+        <w:rPr>
+          <w:b/>
+          <w:bCs/>
+          <w:color w:val="1F3864"/>
+          <w:sz w:val="32"/>
+          <w:szCs w:val="32"/>
+        </w:rPr>
+      </w:pPr>
+      <w:r>
+        <w:rPr>
+          <w:b/>
+          <w:bCs/>
+          <w:color w:val="1F3864"/>
+        </w:rPr>
+        <w:br w:type="page"/>
+      </w:r>
+    </w:p>
+    <w:p>
+      <w:pPr>
         <w:pStyle w:val="1"/>
         <w:spacing w:before="320" w:after="160"/>
       </w:pPr>
@@ -6860,6 +8272,7 @@
           <w:bCs/>
           <w:color w:val="1F3864"/>
         </w:rPr>
+        <w:lastRenderedPageBreak/>
         <w:t>5. 방어 정리</w:t>
       </w:r>
     </w:p>
@@ -7099,7 +8512,6 @@
                 <w:sz w:val="18"/>
                 <w:szCs w:val="18"/>
               </w:rPr>
-              <w:lastRenderedPageBreak/>
               <w:t>payload 노출 → 공격 범위 확대</w:t>
             </w:r>
           </w:p>
@@ -7224,7 +8636,7 @@
                 <w:sz w:val="18"/>
                 <w:szCs w:val="18"/>
               </w:rPr>
-              <w:t xml:space="preserve">DB 유출 시 refresh 원문 노출</w:t>
+              <w:t>DB 유출 시 refresh 원문 노출</w:t>
             </w:r>
           </w:p>
         </w:tc>
@@ -7244,7 +8656,7 @@
                 <w:sz w:val="18"/>
                 <w:szCs w:val="18"/>
               </w:rPr>
-              <w:t xml:space="preserve">해시(SHA-256) 저장(적용됨) — DB 유출돼도 원문 복원 불가</w:t>
+              <w:t>해시(SHA-256) 저장(적용됨) — DB 유출돼도 원문 복원 불가</w:t>
             </w:r>
           </w:p>
         </w:tc>
@@ -7264,7 +8676,7 @@
                 <w:sz w:val="18"/>
                 <w:szCs w:val="18"/>
               </w:rPr>
-              <w:t xml:space="preserve">2단계 보강</w:t>
+              <w:t>2단계 보강</w:t>
             </w:r>
           </w:p>
         </w:tc>
@@ -7286,7 +8698,7 @@
                 <w:sz w:val="18"/>
                 <w:szCs w:val="18"/>
               </w:rPr>
-              <w:t xml:space="preserve">탈취된 refresh 재사용</w:t>
+              <w:t>탈취된 refresh 재사용</w:t>
             </w:r>
           </w:p>
         </w:tc>
@@ -7306,7 +8718,7 @@
                 <w:sz w:val="18"/>
                 <w:szCs w:val="18"/>
               </w:rPr>
-              <w:t xml:space="preserve">재사용 탐지 → 해당 사용자 전체 세션 일괄 폐기(적용됨)</w:t>
+              <w:t>재사용 탐지 → 해당 사용자 전체 세션 일괄 폐기(적용됨)</w:t>
             </w:r>
           </w:p>
         </w:tc>
@@ -7326,7 +8738,7 @@
                 <w:sz w:val="18"/>
                 <w:szCs w:val="18"/>
               </w:rPr>
-              <w:t xml:space="preserve">2단계 보강</w:t>
+              <w:t>2단계 보강</w:t>
             </w:r>
           </w:p>
         </w:tc>
@@ -7514,7 +8926,74 @@
         <w:spacing w:after="80" w:line="272" w:lineRule="auto"/>
       </w:pPr>
       <w:r>
-        <w:t>access 는 API 호출마다 Authorization 헤더로 보내는 단기 JWT(권한 증표)다. 자주 노출되므로 짧게 둔다. refresh 는 access 가 만료됐을 때 새 access 를 받기 위한 장기 자격으로, 평소엔 보관만 하고 /refresh 호출 때만 쓴다. 이 앱의 refresh 는 JWT 가 아니라 서버 DB 에 저장한 무작위 값이라 폐기(로그아웃)·회전이 가능하다. 요약: access=짧고 자주, refresh=길고 가끔·서버가 통제.</w:t>
+        <w:t xml:space="preserve">access 는 API 호출마다 Authorization 헤더로 보내는 단기 JWT(권한 증표)다. 자주 노출되므로 짧게 둔다. refresh 는 access 가 만료됐을 때 새 access 를 받기 위한 장기 자격으로, 평소엔 보관만 하고 /refresh </w:t>
+        <w:lastRenderedPageBreak/>
+        <w:t>호출 때만 쓴다. 이 앱의 refresh 는 JWT 가 아니라 서버 DB 에 저장한 무작위 값이라 폐기(로그아웃)·회전이 가능하다. 요약: access=짧고 자주, refresh=길고 가끔·서버가 통제.</w:t>
+      </w:r>
+    </w:p>
+    <w:p>
+      <w:pPr>
+        <w:pStyle w:val="3"/>
+        <w:spacing w:before="200" w:after="80"/>
+      </w:pPr>
+      <w:r>
+        <w:rPr>
+          <w:b/>
+          <w:bCs/>
+          <w:color w:val="2E5496"/>
+        </w:rPr>
+        <w:t xml:space="preserve">Q3. 토큰이 없거나 유효하지 않아 401 이 발생했는데 [AUDIT] 로그가 안 남는 경우가 있었다. 원인은?</w:t>
+      </w:r>
+    </w:p>
+    <w:p>
+      <w:pPr>
+        <w:spacing w:after="80" w:line="272" w:lineRule="auto"/>
+      </w:pPr>
+      <w:r>
+        <w:t xml:space="preserve">감사 로그 출처가 두 군데로 나뉘어 있었기 때문이다.</w:t>
+      </w:r>
+    </w:p>
+    <w:p>
+      <w:pPr>
+        <w:spacing w:after="80" w:line="272" w:lineRule="auto"/>
+      </w:pPr>
+      <w:r>
+        <w:t xml:space="preserve">- 로그인 성공/실패(아이디·비밀번호 불일치 등)는 SecurityAuditListener 가 Spring Security 의 AuthenticationSuccessEvent/AbstractAuthenticationFailureEvent 를 구독해 [AUDIT]로 남긴다.</w:t>
+      </w:r>
+    </w:p>
+    <w:p>
+      <w:pPr>
+        <w:spacing w:after="80" w:line="272" w:lineRule="auto"/>
+      </w:pPr>
+      <w:r>
+        <w:t xml:space="preserve">- 토큰이 없거나 유효하지 않아 API 호출 자체가 거부되는 401 은 SecurityConfig 의 authenticationEntryPoint() 에서 응답이 만들어진다. 이 처리는 Security 필터 체인(ExceptionTranslationFilter) 안에서 끝나며 DispatcherServlet/컨트롤러까지 요청이 도달하지 않는다. 그런데 기존 [AUDIT] 로그는 DefaultExceptionAdvice 의 @ExceptionHandler(AuthenticationException.class)(컨트롤러 실행 중 발생한 예외만 받는 @RestControllerAdvice)에만 있었으므로, 이 경로에서는 호출될 수 없어 로그가 비어 있었다.</w:t>
+      </w:r>
+    </w:p>
+    <w:p>
+      <w:pPr>
+        <w:spacing w:after="80" w:line="272" w:lineRule="auto"/>
+      </w:pPr>
+      <w:r>
+        <w:t xml:space="preserve">수정: authenticationEntryPoint() 내부에서 응답을 쓰기 직전에 직접 [AUDIT] 로그를 남기도록 변경했다(SecurityConfig.java). 요청 메서드·URI·클라이언트 IP·실패 사유를 함께 기록한다.</w:t>
+      </w:r>
+    </w:p>
+    <w:p>
+      <w:pPr>
+        <w:pBdr>
+          <w:top w:val="single" w:sz="4" w:space="3" w:color="D9D9D9"/>
+          <w:left w:val="single" w:sz="18" w:space="6" w:color="C0C0C0"/>
+          <w:bottom w:val="single" w:sz="4" w:space="3" w:color="D9D9D9"/>
+        </w:pBdr>
+        <w:shd w:val="clear" w:color="auto" w:fill="F4F4F4"/>
+        <w:spacing w:after="160"/>
+      </w:pPr>
+      <w:r>
+        <w:rPr>
+          <w:rFonts w:ascii="Consolas" w:hAnsi="Consolas"/>
+          <w:sz w:val="18"/>
+          <w:szCs w:val="18"/>
+        </w:rPr>
+        <w:t xml:space="preserve">[AUDIT] 인증 실패(401) - GET /api/students from 0:0:0:0:0:0:0:1 : Full authentication is required to access this resource</w:t>
       </w:r>
     </w:p>
     <w:sectPr>

</xml_diff>